<commit_message>
Rebuild Week 12 menu around actual surplus inventory
Surplus items: carrot chips, broccoli, dehydrated hash browns, sweet potatoes.

Menu items utilizing surplus:
- Carrot Chips: Asian Ginger Pickled Carrot Jars, Carrot Chip Snack Cup w/ Ranch
- Broccoli: Beef & Broccoli Stir-Fry Bowl, Broccoli Cheddar Mac Bowl, Broccoli Crunch Salad
- Hash Browns: Loaded Hash Brown Breakfast Bowl
- Sweet Potatoes: Golden Hour Bowl, Harvest Bowl, Sweet Potato Wrap, Sweet Potato Pie Parfait

158 total units across both distribution days.

https://claude.ai/code/session_01RoU8RfG3RfKf7Zo4boqHgn
</commit_message>
<xml_diff>
--- a/CC_GrabAndGo_Week12_Partner_v1.docx
+++ b/CC_GrabAndGo_Week12_Partner_v1.docx
@@ -16,7 +16,7 @@
           <w:sz w:val="36"/>
           <w:szCs w:val="36"/>
         </w:rPr>
-        <w:t xml:space="preserve">WEEKLY GRAB &amp; GO MENU</w:t>
+        <w:t>WEEKLY GRAB &amp; GO MENU</w:t>
       </w:r>
     </w:p>
     <w:p>
@@ -48,7 +48,7 @@
           <w:sz w:val="20"/>
           <w:szCs w:val="20"/>
         </w:rPr>
-        <w:t xml:space="preserve">Distribution: Monday PM (Conroe &amp; New Caney)  |  Friday AM (Conroe Only)</w:t>
+        <w:t>Distribution: Monday PM (Conroe &amp; New Caney)  |  Friday AM (Conroe Only)</w:t>
       </w:r>
     </w:p>
     <w:tbl>
@@ -1133,7 +1133,7 @@
                 <w:sz w:val="19"/>
                 <w:szCs w:val="19"/>
               </w:rPr>
-              <w:t>Bean &amp; Cheese Breakfast Taco w/ 2 oz Salsa</w:t>
+              <w:t>Loaded Hash Brown Breakfast Bowl</w:t>
             </w:r>
           </w:p>
         </w:tc>
@@ -1313,7 +1313,7 @@
                 <w:sz w:val="17"/>
                 <w:szCs w:val="17"/>
               </w:rPr>
-              <w:t>Surplus black beans</w:t>
+              <w:t>Surplus hash browns</w:t>
             </w:r>
           </w:p>
         </w:tc>
@@ -2279,7 +2279,7 @@
                 <w:sz w:val="19"/>
                 <w:szCs w:val="19"/>
               </w:rPr>
-              <w:t>Chicken Caesar Salad</w:t>
+              <w:t>Broccoli Crunch Salad</w:t>
             </w:r>
           </w:p>
         </w:tc>
@@ -2459,7 +2459,7 @@
                 <w:sz w:val="17"/>
                 <w:szCs w:val="17"/>
               </w:rPr>
-              <w:t>Surplus chicken</w:t>
+              <w:t>Surplus broccoli</w:t>
             </w:r>
           </w:p>
         </w:tc>
@@ -3201,7 +3201,7 @@
                 <w:sz w:val="19"/>
                 <w:szCs w:val="19"/>
               </w:rPr>
-              <w:t>Chicken Caesar Wrap</w:t>
+              <w:t>Roasted Sweet Potato &amp; Black Bean Wrap</w:t>
             </w:r>
           </w:p>
         </w:tc>
@@ -3381,7 +3381,7 @@
                 <w:sz w:val="17"/>
                 <w:szCs w:val="17"/>
               </w:rPr>
-              <w:t>Surplus chicken</w:t>
+              <w:t>Surplus sweet potatoes</w:t>
             </w:r>
           </w:p>
         </w:tc>
@@ -4123,7 +4123,7 @@
                 <w:sz w:val="19"/>
                 <w:szCs w:val="19"/>
               </w:rPr>
-              <w:t>Chicken Fajita Bowl (Rice)</w:t>
+              <w:t>Beef &amp; Broccoli Stir-Fry Bowl (Rice)</w:t>
             </w:r>
           </w:p>
         </w:tc>
@@ -4303,7 +4303,7 @@
                 <w:sz w:val="17"/>
                 <w:szCs w:val="17"/>
               </w:rPr>
-              <w:t>Surplus chicken &amp; peppers</w:t>
+              <w:t>Surplus broccoli</w:t>
             </w:r>
           </w:p>
         </w:tc>
@@ -4342,7 +4342,7 @@
                 <w:sz w:val="19"/>
                 <w:szCs w:val="19"/>
               </w:rPr>
-              <w:t>Southwest Black Bean &amp; Rice Bowl</w:t>
+              <w:t>Broccoli Cheddar Mac Bowl</w:t>
             </w:r>
           </w:p>
         </w:tc>
@@ -4527,7 +4527,7 @@
                 <w:sz w:val="17"/>
                 <w:szCs w:val="17"/>
               </w:rPr>
-              <w:t>Surplus black beans &amp; peppers</w:t>
+              <w:t>Surplus broccoli</w:t>
             </w:r>
           </w:p>
         </w:tc>
@@ -4565,43 +4565,43 @@
                 <w:sz w:val="19"/>
                 <w:szCs w:val="19"/>
               </w:rPr>
-              <w:t>Cilantro Lime Chicken Bowl (Rice)</w:t>
-            </w:r>
-          </w:p>
-        </w:tc>
-        <w:tc>
-          <w:tcPr>
-            <w:tcW w:type="dxa" w:w="1800"/>
-            <w:tcBorders>
-              <w:top w:val="single" w:color="C5CDD4" w:sz="1"/>
-              <w:left w:val="single" w:color="C5CDD4" w:sz="1"/>
-              <w:bottom w:val="single" w:color="C5CDD4" w:sz="1"/>
-              <w:right w:val="single" w:color="C5CDD4" w:sz="1"/>
-            </w:tcBorders>
-            <w:tcMar>
-              <w:top w:type="dxa" w:w="50"/>
-              <w:left w:type="dxa" w:w="80"/>
-              <w:bottom w:type="dxa" w:w="50"/>
-              <w:right w:type="dxa" w:w="80"/>
-            </w:tcMar>
-          </w:tcPr>
-          <w:p>
-            <w:pPr>
-              <w:spacing w:after="15" w:before="15"/>
-              <w:jc w:val="center"/>
-            </w:pPr>
-            <w:r>
-              <w:rPr>
-                <w:rFonts w:ascii="Arial" w:cs="Arial" w:eastAsia="Arial" w:hAnsi="Arial"/>
-                <w:b w:val="false"/>
-                <w:bCs w:val="false"/>
-                <w:i w:val="false"/>
-                <w:iCs w:val="false"/>
-                <w:color w:val="1A1A1A"/>
-                <w:sz w:val="19"/>
-                <w:szCs w:val="19"/>
-              </w:rPr>
-              <w:t>1</w:t>
+              <w:t>Golden Hour Sweet Potato Bowl</w:t>
+            </w:r>
+          </w:p>
+        </w:tc>
+        <w:tc>
+          <w:tcPr>
+            <w:tcW w:type="dxa" w:w="1800"/>
+            <w:tcBorders>
+              <w:top w:val="single" w:color="C5CDD4" w:sz="1"/>
+              <w:left w:val="single" w:color="C5CDD4" w:sz="1"/>
+              <w:bottom w:val="single" w:color="C5CDD4" w:sz="1"/>
+              <w:right w:val="single" w:color="C5CDD4" w:sz="1"/>
+            </w:tcBorders>
+            <w:tcMar>
+              <w:top w:type="dxa" w:w="50"/>
+              <w:left w:type="dxa" w:w="80"/>
+              <w:bottom w:type="dxa" w:w="50"/>
+              <w:right w:type="dxa" w:w="80"/>
+            </w:tcMar>
+          </w:tcPr>
+          <w:p>
+            <w:pPr>
+              <w:spacing w:after="15" w:before="15"/>
+              <w:jc w:val="center"/>
+            </w:pPr>
+            <w:r>
+              <w:rPr>
+                <w:rFonts w:ascii="Arial" w:cs="Arial" w:eastAsia="Arial" w:hAnsi="Arial"/>
+                <w:b w:val="false"/>
+                <w:bCs w:val="false"/>
+                <w:i w:val="false"/>
+                <w:iCs w:val="false"/>
+                <w:color w:val="1A1A1A"/>
+                <w:sz w:val="19"/>
+                <w:szCs w:val="19"/>
+              </w:rPr>
+              <w:t>2</w:t>
             </w:r>
           </w:p>
         </w:tc>
@@ -4709,7 +4709,7 @@
                 <w:sz w:val="19"/>
                 <w:szCs w:val="19"/>
               </w:rPr>
-              <w:t>5</w:t>
+              <w:t>6</w:t>
             </w:r>
           </w:p>
         </w:tc>
@@ -4745,7 +4745,7 @@
                 <w:sz w:val="17"/>
                 <w:szCs w:val="17"/>
               </w:rPr>
-              <w:t>Surplus chicken &amp; cilantro</w:t>
+              <w:t>Surplus sweet potatoes</w:t>
             </w:r>
           </w:p>
         </w:tc>
@@ -4784,6 +4784,7 @@
                 <w:sz w:val="19"/>
                 <w:szCs w:val="19"/>
               </w:rPr>
+              <w:t>Harvest Sweet Potato Bowl</w:t>
             </w:r>
           </w:p>
         </w:tc>
@@ -4820,6 +4821,7 @@
                 <w:sz w:val="19"/>
                 <w:szCs w:val="19"/>
               </w:rPr>
+              <w:t>2</w:t>
             </w:r>
           </w:p>
         </w:tc>
@@ -4856,6 +4858,7 @@
                 <w:sz w:val="19"/>
                 <w:szCs w:val="19"/>
               </w:rPr>
+              <w:t>4</w:t>
             </w:r>
           </w:p>
         </w:tc>
@@ -4892,6 +4895,7 @@
                 <w:sz w:val="19"/>
                 <w:szCs w:val="19"/>
               </w:rPr>
+              <w:t>0</w:t>
             </w:r>
           </w:p>
         </w:tc>
@@ -4928,6 +4932,7 @@
                 <w:sz w:val="19"/>
                 <w:szCs w:val="19"/>
               </w:rPr>
+              <w:t>6</w:t>
             </w:r>
           </w:p>
         </w:tc>
@@ -4964,6 +4969,7 @@
                 <w:sz w:val="17"/>
                 <w:szCs w:val="17"/>
               </w:rPr>
+              <w:t>Surplus sweet potatoes</w:t>
             </w:r>
           </w:p>
         </w:tc>
@@ -5481,7 +5487,7 @@
                 <w:sz w:val="18"/>
                 <w:szCs w:val="18"/>
               </w:rPr>
-              <w:t>5</w:t>
+              <w:t>8</w:t>
             </w:r>
           </w:p>
         </w:tc>
@@ -5518,7 +5524,7 @@
                 <w:sz w:val="18"/>
                 <w:szCs w:val="18"/>
               </w:rPr>
-              <w:t>12</w:t>
+              <w:t>16</w:t>
             </w:r>
           </w:p>
         </w:tc>
@@ -5592,7 +5598,7 @@
                 <w:sz w:val="18"/>
                 <w:szCs w:val="18"/>
               </w:rPr>
-              <w:t>17</w:t>
+              <w:t>24</w:t>
             </w:r>
           </w:p>
         </w:tc>
@@ -5961,7 +5967,7 @@
                 <w:sz w:val="19"/>
                 <w:szCs w:val="19"/>
               </w:rPr>
-              <w:t>4</w:t>
+              <w:t>6</w:t>
             </w:r>
           </w:p>
         </w:tc>
@@ -5998,7 +6004,7 @@
                 <w:sz w:val="19"/>
                 <w:szCs w:val="19"/>
               </w:rPr>
-              <w:t>4</w:t>
+              <w:t>6</w:t>
             </w:r>
           </w:p>
         </w:tc>
@@ -6072,7 +6078,7 @@
                 <w:sz w:val="19"/>
                 <w:szCs w:val="19"/>
               </w:rPr>
-              <w:t>8</w:t>
+              <w:t>12</w:t>
             </w:r>
           </w:p>
         </w:tc>
@@ -6109,6 +6115,7 @@
                 <w:sz w:val="17"/>
                 <w:szCs w:val="17"/>
               </w:rPr>
+              <w:t>Surplus carrot chips</w:t>
             </w:r>
           </w:p>
         </w:tc>
@@ -6146,115 +6153,115 @@
                 <w:sz w:val="19"/>
                 <w:szCs w:val="19"/>
               </w:rPr>
-              <w:t xml:space="preserve"/>
-            </w:r>
-          </w:p>
-        </w:tc>
-        <w:tc>
-          <w:tcPr>
-            <w:tcW w:type="dxa" w:w="1800"/>
-            <w:tcBorders>
-              <w:top w:val="single" w:color="C5CDD4" w:sz="1"/>
-              <w:left w:val="single" w:color="C5CDD4" w:sz="1"/>
-              <w:bottom w:val="single" w:color="C5CDD4" w:sz="1"/>
-              <w:right w:val="single" w:color="C5CDD4" w:sz="1"/>
-            </w:tcBorders>
-            <w:tcMar>
-              <w:top w:type="dxa" w:w="50"/>
-              <w:left w:type="dxa" w:w="80"/>
-              <w:bottom w:type="dxa" w:w="50"/>
-              <w:right w:type="dxa" w:w="80"/>
-            </w:tcMar>
-          </w:tcPr>
-          <w:p>
-            <w:pPr>
-              <w:spacing w:after="15" w:before="15"/>
-              <w:jc w:val="center"/>
-            </w:pPr>
-            <w:r>
-              <w:rPr>
-                <w:rFonts w:ascii="Arial" w:cs="Arial" w:eastAsia="Arial" w:hAnsi="Arial"/>
-                <w:b w:val="false"/>
-                <w:bCs w:val="false"/>
-                <w:i w:val="false"/>
-                <w:iCs w:val="false"/>
-                <w:color w:val="1A1A1A"/>
-                <w:sz w:val="19"/>
-                <w:szCs w:val="19"/>
-              </w:rPr>
-              <w:t xml:space="preserve"/>
-            </w:r>
-          </w:p>
-        </w:tc>
-        <w:tc>
-          <w:tcPr>
-            <w:tcW w:type="dxa" w:w="1800"/>
-            <w:tcBorders>
-              <w:top w:val="single" w:color="C5CDD4" w:sz="1"/>
-              <w:left w:val="single" w:color="C5CDD4" w:sz="1"/>
-              <w:bottom w:val="single" w:color="C5CDD4" w:sz="1"/>
-              <w:right w:val="single" w:color="C5CDD4" w:sz="1"/>
-            </w:tcBorders>
-            <w:tcMar>
-              <w:top w:type="dxa" w:w="50"/>
-              <w:left w:type="dxa" w:w="80"/>
-              <w:bottom w:type="dxa" w:w="50"/>
-              <w:right w:type="dxa" w:w="80"/>
-            </w:tcMar>
-          </w:tcPr>
-          <w:p>
-            <w:pPr>
-              <w:spacing w:after="15" w:before="15"/>
-              <w:jc w:val="center"/>
-            </w:pPr>
-            <w:r>
-              <w:rPr>
-                <w:rFonts w:ascii="Arial" w:cs="Arial" w:eastAsia="Arial" w:hAnsi="Arial"/>
-                <w:b w:val="false"/>
-                <w:bCs w:val="false"/>
-                <w:i w:val="false"/>
-                <w:iCs w:val="false"/>
-                <w:color w:val="1A1A1A"/>
-                <w:sz w:val="19"/>
-                <w:szCs w:val="19"/>
-              </w:rPr>
-              <w:t xml:space="preserve"/>
-            </w:r>
-          </w:p>
-        </w:tc>
-        <w:tc>
-          <w:tcPr>
-            <w:tcW w:type="dxa" w:w="1800"/>
-            <w:tcBorders>
-              <w:top w:val="single" w:color="C5CDD4" w:sz="1"/>
-              <w:left w:val="single" w:color="C5CDD4" w:sz="1"/>
-              <w:bottom w:val="single" w:color="C5CDD4" w:sz="1"/>
-              <w:right w:val="single" w:color="C5CDD4" w:sz="1"/>
-            </w:tcBorders>
-            <w:tcMar>
-              <w:top w:type="dxa" w:w="50"/>
-              <w:left w:type="dxa" w:w="80"/>
-              <w:bottom w:type="dxa" w:w="50"/>
-              <w:right w:type="dxa" w:w="80"/>
-            </w:tcMar>
-          </w:tcPr>
-          <w:p>
-            <w:pPr>
-              <w:spacing w:after="15" w:before="15"/>
-              <w:jc w:val="center"/>
-            </w:pPr>
-            <w:r>
-              <w:rPr>
-                <w:rFonts w:ascii="Arial" w:cs="Arial" w:eastAsia="Arial" w:hAnsi="Arial"/>
-                <w:b w:val="false"/>
-                <w:bCs w:val="false"/>
-                <w:i w:val="false"/>
-                <w:iCs w:val="false"/>
-                <w:color w:val="1A1A1A"/>
-                <w:sz w:val="19"/>
-                <w:szCs w:val="19"/>
-              </w:rPr>
-              <w:t xml:space="preserve"/>
+              <w:t>Carrot Chip Snack Cup w/ Ranch</w:t>
+            </w:r>
+          </w:p>
+        </w:tc>
+        <w:tc>
+          <w:tcPr>
+            <w:tcW w:type="dxa" w:w="1800"/>
+            <w:tcBorders>
+              <w:top w:val="single" w:color="C5CDD4" w:sz="1"/>
+              <w:left w:val="single" w:color="C5CDD4" w:sz="1"/>
+              <w:bottom w:val="single" w:color="C5CDD4" w:sz="1"/>
+              <w:right w:val="single" w:color="C5CDD4" w:sz="1"/>
+            </w:tcBorders>
+            <w:tcMar>
+              <w:top w:type="dxa" w:w="50"/>
+              <w:left w:type="dxa" w:w="80"/>
+              <w:bottom w:type="dxa" w:w="50"/>
+              <w:right w:type="dxa" w:w="80"/>
+            </w:tcMar>
+          </w:tcPr>
+          <w:p>
+            <w:pPr>
+              <w:spacing w:after="15" w:before="15"/>
+              <w:jc w:val="center"/>
+            </w:pPr>
+            <w:r>
+              <w:rPr>
+                <w:rFonts w:ascii="Arial" w:cs="Arial" w:eastAsia="Arial" w:hAnsi="Arial"/>
+                <w:b w:val="false"/>
+                <w:bCs w:val="false"/>
+                <w:i w:val="false"/>
+                <w:iCs w:val="false"/>
+                <w:color w:val="1A1A1A"/>
+                <w:sz w:val="19"/>
+                <w:szCs w:val="19"/>
+              </w:rPr>
+              <w:t>3</w:t>
+            </w:r>
+          </w:p>
+        </w:tc>
+        <w:tc>
+          <w:tcPr>
+            <w:tcW w:type="dxa" w:w="1800"/>
+            <w:tcBorders>
+              <w:top w:val="single" w:color="C5CDD4" w:sz="1"/>
+              <w:left w:val="single" w:color="C5CDD4" w:sz="1"/>
+              <w:bottom w:val="single" w:color="C5CDD4" w:sz="1"/>
+              <w:right w:val="single" w:color="C5CDD4" w:sz="1"/>
+            </w:tcBorders>
+            <w:tcMar>
+              <w:top w:type="dxa" w:w="50"/>
+              <w:left w:type="dxa" w:w="80"/>
+              <w:bottom w:type="dxa" w:w="50"/>
+              <w:right w:type="dxa" w:w="80"/>
+            </w:tcMar>
+          </w:tcPr>
+          <w:p>
+            <w:pPr>
+              <w:spacing w:after="15" w:before="15"/>
+              <w:jc w:val="center"/>
+            </w:pPr>
+            <w:r>
+              <w:rPr>
+                <w:rFonts w:ascii="Arial" w:cs="Arial" w:eastAsia="Arial" w:hAnsi="Arial"/>
+                <w:b w:val="false"/>
+                <w:bCs w:val="false"/>
+                <w:i w:val="false"/>
+                <w:iCs w:val="false"/>
+                <w:color w:val="1A1A1A"/>
+                <w:sz w:val="19"/>
+                <w:szCs w:val="19"/>
+              </w:rPr>
+              <w:t>3</w:t>
+            </w:r>
+          </w:p>
+        </w:tc>
+        <w:tc>
+          <w:tcPr>
+            <w:tcW w:type="dxa" w:w="1800"/>
+            <w:tcBorders>
+              <w:top w:val="single" w:color="C5CDD4" w:sz="1"/>
+              <w:left w:val="single" w:color="C5CDD4" w:sz="1"/>
+              <w:bottom w:val="single" w:color="C5CDD4" w:sz="1"/>
+              <w:right w:val="single" w:color="C5CDD4" w:sz="1"/>
+            </w:tcBorders>
+            <w:tcMar>
+              <w:top w:type="dxa" w:w="50"/>
+              <w:left w:type="dxa" w:w="80"/>
+              <w:bottom w:type="dxa" w:w="50"/>
+              <w:right w:type="dxa" w:w="80"/>
+            </w:tcMar>
+          </w:tcPr>
+          <w:p>
+            <w:pPr>
+              <w:spacing w:after="15" w:before="15"/>
+              <w:jc w:val="center"/>
+            </w:pPr>
+            <w:r>
+              <w:rPr>
+                <w:rFonts w:ascii="Arial" w:cs="Arial" w:eastAsia="Arial" w:hAnsi="Arial"/>
+                <w:b w:val="false"/>
+                <w:bCs w:val="false"/>
+                <w:i w:val="false"/>
+                <w:iCs w:val="false"/>
+                <w:color w:val="1A1A1A"/>
+                <w:sz w:val="19"/>
+                <w:szCs w:val="19"/>
+              </w:rPr>
+              <w:t>6</w:t>
             </w:r>
           </w:p>
         </w:tc>
@@ -6290,7 +6297,7 @@
                 <w:sz w:val="19"/>
                 <w:szCs w:val="19"/>
               </w:rPr>
-              <w:t xml:space="preserve"/>
+              <w:t>12</w:t>
             </w:r>
           </w:p>
         </w:tc>
@@ -6326,7 +6333,7 @@
                 <w:sz w:val="17"/>
                 <w:szCs w:val="17"/>
               </w:rPr>
-              <w:t xml:space="preserve"/>
+              <w:t>Surplus carrot chips</w:t>
             </w:r>
           </w:p>
         </w:tc>
@@ -6626,7 +6633,7 @@
                 <w:sz w:val="18"/>
                 <w:szCs w:val="18"/>
               </w:rPr>
-              <w:t>4</w:t>
+              <w:t>9</w:t>
             </w:r>
           </w:p>
         </w:tc>
@@ -6663,7 +6670,7 @@
                 <w:sz w:val="18"/>
                 <w:szCs w:val="18"/>
               </w:rPr>
-              <w:t>9</w:t>
+              <w:t>14</w:t>
             </w:r>
           </w:p>
         </w:tc>
@@ -6700,7 +6707,7 @@
                 <w:sz w:val="18"/>
                 <w:szCs w:val="18"/>
               </w:rPr>
-              <w:t>12</w:t>
+              <w:t>18</w:t>
             </w:r>
           </w:p>
         </w:tc>
@@ -6737,7 +6744,7 @@
                 <w:sz w:val="18"/>
                 <w:szCs w:val="18"/>
               </w:rPr>
-              <w:t>25</w:t>
+              <w:t>41</w:t>
             </w:r>
           </w:p>
         </w:tc>
@@ -6850,7 +6857,7 @@
                 <w:sz w:val="19"/>
                 <w:szCs w:val="19"/>
               </w:rPr>
-              <w:t>Apple Cinnamon Granola Parfait</w:t>
+              <w:t>Sweet Potato Pie Parfait</w:t>
             </w:r>
           </w:p>
         </w:tc>
@@ -7030,7 +7037,7 @@
                 <w:sz w:val="17"/>
                 <w:szCs w:val="17"/>
               </w:rPr>
-              <w:t>Surplus apples &amp; yogurt</w:t>
+              <w:t>Surplus sweet potatoes</w:t>
             </w:r>
           </w:p>
         </w:tc>
@@ -7772,7 +7779,7 @@
                 <w:sz w:val="22"/>
                 <w:szCs w:val="22"/>
               </w:rPr>
-              <w:t>30</w:t>
+              <w:t>38</w:t>
             </w:r>
           </w:p>
         </w:tc>
@@ -7809,7 +7816,7 @@
                 <w:sz w:val="22"/>
                 <w:szCs w:val="22"/>
               </w:rPr>
-              <w:t>48</w:t>
+              <w:t>57</w:t>
             </w:r>
           </w:p>
         </w:tc>
@@ -7846,7 +7853,7 @@
                 <w:sz w:val="22"/>
                 <w:szCs w:val="22"/>
               </w:rPr>
-              <w:t>57</w:t>
+              <w:t>63</w:t>
             </w:r>
           </w:p>
         </w:tc>
@@ -7883,7 +7890,7 @@
                 <w:sz w:val="22"/>
                 <w:szCs w:val="22"/>
               </w:rPr>
-              <w:t>135</w:t>
+              <w:t>158</w:t>
             </w:r>
           </w:p>
         </w:tc>
@@ -7947,7 +7954,7 @@
           <w:sz w:val="22"/>
           <w:szCs w:val="22"/>
         </w:rPr>
-        <w:t xml:space="preserve">NOTES</w:t>
+        <w:t>NOTES</w:t>
       </w:r>
     </w:p>
     <w:p>
@@ -7961,7 +7968,7 @@
           <w:sz w:val="18"/>
           <w:szCs w:val="18"/>
         </w:rPr>
-        <w:t xml:space="preserve">Menu items are selected weekly based on available surplus ingredients, supporting our food rescue mission and zero-waste commitment.</w:t>
+        <w:t>Menu items are selected weekly based on available surplus ingredients, supporting our food rescue mission and zero-waste commitment.</w:t>
       </w:r>
     </w:p>
     <w:p>
@@ -7975,7 +7982,7 @@
           <w:sz w:val="18"/>
           <w:szCs w:val="18"/>
         </w:rPr>
-        <w:t xml:space="preserve">This week’s surplus: Strawberries, Carrots / Carrot Chips, Sweet Potatoes, Shredded Cabbage, 1% Milk, Brisket (cooked).</w:t>
+        <w:t>This week’s surplus: Strawberries, Carrots / Carrot Chips, Sweet Potatoes, Shredded Cabbage, 1% Milk, Brisket (cooked).</w:t>
       </w:r>
     </w:p>
     <w:p>
@@ -7989,7 +7996,7 @@
           <w:sz w:val="18"/>
           <w:szCs w:val="18"/>
         </w:rPr>
-        <w:t xml:space="preserve">All products are prepared in our licensed commissary kitchen following HACCP food safety protocols.</w:t>
+        <w:t>All products are prepared in our licensed commissary kitchen following HACCP food safety protocols.</w:t>
       </w:r>
     </w:p>
     <w:p>
@@ -8003,7 +8010,7 @@
           <w:sz w:val="18"/>
           <w:szCs w:val="18"/>
         </w:rPr>
-        <w:t xml:space="preserve">Shelf Life: Salads &amp; Wraps (3 days)  |  Lunch Bowls (5 days)  |  Parfaits (3 days)</w:t>
+        <w:t>Shelf Life: Salads &amp; Wraps (3 days)  |  Lunch Bowls (5 days)  |  Parfaits (3 days)</w:t>
       </w:r>
     </w:p>
     <w:p>
@@ -8017,7 +8024,7 @@
           <w:sz w:val="18"/>
           <w:szCs w:val="18"/>
         </w:rPr>
-        <w:t xml:space="preserve">Breakfast tacos include 2 oz salsa side. Empanadas include 2 oz chimichurri side.</w:t>
+        <w:t>Breakfast tacos include 2 oz salsa side. Empanadas include 2 oz chimichurri side.</w:t>
       </w:r>
     </w:p>
     <w:p>

</xml_diff>

<commit_message>
Remove Carrot Chip Snack Cup, Broccoli Cheddar Mac Bowl, and Sweet Potato Pie Parfait
Carrot chips not fresh enough for raw snack cups — keeping only for
pickled jars. Removed two other items per request. Total units reduced
from 158 to 135.

https://claude.ai/code/session_01RoU8RfG3RfKf7Zo4boqHgn
</commit_message>
<xml_diff>
--- a/CC_GrabAndGo_Week12_Partner_v1.docx
+++ b/CC_GrabAndGo_Week12_Partner_v1.docx
@@ -4342,7 +4342,6 @@
                 <w:sz w:val="19"/>
                 <w:szCs w:val="19"/>
               </w:rPr>
-              <w:t>Broccoli Cheddar Mac Bowl</w:t>
             </w:r>
           </w:p>
         </w:tc>
@@ -4379,7 +4378,6 @@
                 <w:sz w:val="19"/>
                 <w:szCs w:val="19"/>
               </w:rPr>
-              <w:t>2</w:t>
             </w:r>
           </w:p>
         </w:tc>
@@ -4416,7 +4414,6 @@
                 <w:sz w:val="19"/>
                 <w:szCs w:val="19"/>
               </w:rPr>
-              <w:t>4</w:t>
             </w:r>
           </w:p>
         </w:tc>
@@ -4453,7 +4450,6 @@
                 <w:sz w:val="19"/>
                 <w:szCs w:val="19"/>
               </w:rPr>
-              <w:t>0</w:t>
             </w:r>
           </w:p>
         </w:tc>
@@ -4490,7 +4486,6 @@
                 <w:sz w:val="19"/>
                 <w:szCs w:val="19"/>
               </w:rPr>
-              <w:t>6</w:t>
             </w:r>
           </w:p>
         </w:tc>
@@ -4527,7 +4522,6 @@
                 <w:sz w:val="17"/>
                 <w:szCs w:val="17"/>
               </w:rPr>
-              <w:t>Surplus broccoli</w:t>
             </w:r>
           </w:p>
         </w:tc>
@@ -5487,7 +5481,7 @@
                 <w:sz w:val="18"/>
                 <w:szCs w:val="18"/>
               </w:rPr>
-              <w:t>8</w:t>
+              <w:t>6</w:t>
             </w:r>
           </w:p>
         </w:tc>
@@ -5524,7 +5518,7 @@
                 <w:sz w:val="18"/>
                 <w:szCs w:val="18"/>
               </w:rPr>
-              <w:t>16</w:t>
+              <w:t>12</w:t>
             </w:r>
           </w:p>
         </w:tc>
@@ -5598,7 +5592,7 @@
                 <w:sz w:val="18"/>
                 <w:szCs w:val="18"/>
               </w:rPr>
-              <w:t>24</w:t>
+              <w:t>18</w:t>
             </w:r>
           </w:p>
         </w:tc>
@@ -6153,115 +6147,111 @@
                 <w:sz w:val="19"/>
                 <w:szCs w:val="19"/>
               </w:rPr>
-              <w:t>Carrot Chip Snack Cup w/ Ranch</w:t>
-            </w:r>
-          </w:p>
-        </w:tc>
-        <w:tc>
-          <w:tcPr>
-            <w:tcW w:type="dxa" w:w="1800"/>
-            <w:tcBorders>
-              <w:top w:val="single" w:color="C5CDD4" w:sz="1"/>
-              <w:left w:val="single" w:color="C5CDD4" w:sz="1"/>
-              <w:bottom w:val="single" w:color="C5CDD4" w:sz="1"/>
-              <w:right w:val="single" w:color="C5CDD4" w:sz="1"/>
-            </w:tcBorders>
-            <w:tcMar>
-              <w:top w:type="dxa" w:w="50"/>
-              <w:left w:type="dxa" w:w="80"/>
-              <w:bottom w:type="dxa" w:w="50"/>
-              <w:right w:type="dxa" w:w="80"/>
-            </w:tcMar>
-          </w:tcPr>
-          <w:p>
-            <w:pPr>
-              <w:spacing w:after="15" w:before="15"/>
-              <w:jc w:val="center"/>
-            </w:pPr>
-            <w:r>
-              <w:rPr>
-                <w:rFonts w:ascii="Arial" w:cs="Arial" w:eastAsia="Arial" w:hAnsi="Arial"/>
-                <w:b w:val="false"/>
-                <w:bCs w:val="false"/>
-                <w:i w:val="false"/>
-                <w:iCs w:val="false"/>
-                <w:color w:val="1A1A1A"/>
-                <w:sz w:val="19"/>
-                <w:szCs w:val="19"/>
-              </w:rPr>
-              <w:t>3</w:t>
-            </w:r>
-          </w:p>
-        </w:tc>
-        <w:tc>
-          <w:tcPr>
-            <w:tcW w:type="dxa" w:w="1800"/>
-            <w:tcBorders>
-              <w:top w:val="single" w:color="C5CDD4" w:sz="1"/>
-              <w:left w:val="single" w:color="C5CDD4" w:sz="1"/>
-              <w:bottom w:val="single" w:color="C5CDD4" w:sz="1"/>
-              <w:right w:val="single" w:color="C5CDD4" w:sz="1"/>
-            </w:tcBorders>
-            <w:tcMar>
-              <w:top w:type="dxa" w:w="50"/>
-              <w:left w:type="dxa" w:w="80"/>
-              <w:bottom w:type="dxa" w:w="50"/>
-              <w:right w:type="dxa" w:w="80"/>
-            </w:tcMar>
-          </w:tcPr>
-          <w:p>
-            <w:pPr>
-              <w:spacing w:after="15" w:before="15"/>
-              <w:jc w:val="center"/>
-            </w:pPr>
-            <w:r>
-              <w:rPr>
-                <w:rFonts w:ascii="Arial" w:cs="Arial" w:eastAsia="Arial" w:hAnsi="Arial"/>
-                <w:b w:val="false"/>
-                <w:bCs w:val="false"/>
-                <w:i w:val="false"/>
-                <w:iCs w:val="false"/>
-                <w:color w:val="1A1A1A"/>
-                <w:sz w:val="19"/>
-                <w:szCs w:val="19"/>
-              </w:rPr>
-              <w:t>3</w:t>
-            </w:r>
-          </w:p>
-        </w:tc>
-        <w:tc>
-          <w:tcPr>
-            <w:tcW w:type="dxa" w:w="1800"/>
-            <w:tcBorders>
-              <w:top w:val="single" w:color="C5CDD4" w:sz="1"/>
-              <w:left w:val="single" w:color="C5CDD4" w:sz="1"/>
-              <w:bottom w:val="single" w:color="C5CDD4" w:sz="1"/>
-              <w:right w:val="single" w:color="C5CDD4" w:sz="1"/>
-            </w:tcBorders>
-            <w:tcMar>
-              <w:top w:type="dxa" w:w="50"/>
-              <w:left w:type="dxa" w:w="80"/>
-              <w:bottom w:type="dxa" w:w="50"/>
-              <w:right w:type="dxa" w:w="80"/>
-            </w:tcMar>
-          </w:tcPr>
-          <w:p>
-            <w:pPr>
-              <w:spacing w:after="15" w:before="15"/>
-              <w:jc w:val="center"/>
-            </w:pPr>
-            <w:r>
-              <w:rPr>
-                <w:rFonts w:ascii="Arial" w:cs="Arial" w:eastAsia="Arial" w:hAnsi="Arial"/>
-                <w:b w:val="false"/>
-                <w:bCs w:val="false"/>
-                <w:i w:val="false"/>
-                <w:iCs w:val="false"/>
-                <w:color w:val="1A1A1A"/>
-                <w:sz w:val="19"/>
-                <w:szCs w:val="19"/>
-              </w:rPr>
-              <w:t>6</w:t>
+            </w:r>
+          </w:p>
+        </w:tc>
+        <w:tc>
+          <w:tcPr>
+            <w:tcW w:type="dxa" w:w="1800"/>
+            <w:tcBorders>
+              <w:top w:val="single" w:color="C5CDD4" w:sz="1"/>
+              <w:left w:val="single" w:color="C5CDD4" w:sz="1"/>
+              <w:bottom w:val="single" w:color="C5CDD4" w:sz="1"/>
+              <w:right w:val="single" w:color="C5CDD4" w:sz="1"/>
+            </w:tcBorders>
+            <w:tcMar>
+              <w:top w:type="dxa" w:w="50"/>
+              <w:left w:type="dxa" w:w="80"/>
+              <w:bottom w:type="dxa" w:w="50"/>
+              <w:right w:type="dxa" w:w="80"/>
+            </w:tcMar>
+          </w:tcPr>
+          <w:p>
+            <w:pPr>
+              <w:spacing w:after="15" w:before="15"/>
+              <w:jc w:val="center"/>
+            </w:pPr>
+            <w:r>
+              <w:rPr>
+                <w:rFonts w:ascii="Arial" w:cs="Arial" w:eastAsia="Arial" w:hAnsi="Arial"/>
+                <w:b w:val="false"/>
+                <w:bCs w:val="false"/>
+                <w:i w:val="false"/>
+                <w:iCs w:val="false"/>
+                <w:color w:val="1A1A1A"/>
+                <w:sz w:val="19"/>
+                <w:szCs w:val="19"/>
+              </w:rPr>
+            </w:r>
+          </w:p>
+        </w:tc>
+        <w:tc>
+          <w:tcPr>
+            <w:tcW w:type="dxa" w:w="1800"/>
+            <w:tcBorders>
+              <w:top w:val="single" w:color="C5CDD4" w:sz="1"/>
+              <w:left w:val="single" w:color="C5CDD4" w:sz="1"/>
+              <w:bottom w:val="single" w:color="C5CDD4" w:sz="1"/>
+              <w:right w:val="single" w:color="C5CDD4" w:sz="1"/>
+            </w:tcBorders>
+            <w:tcMar>
+              <w:top w:type="dxa" w:w="50"/>
+              <w:left w:type="dxa" w:w="80"/>
+              <w:bottom w:type="dxa" w:w="50"/>
+              <w:right w:type="dxa" w:w="80"/>
+            </w:tcMar>
+          </w:tcPr>
+          <w:p>
+            <w:pPr>
+              <w:spacing w:after="15" w:before="15"/>
+              <w:jc w:val="center"/>
+            </w:pPr>
+            <w:r>
+              <w:rPr>
+                <w:rFonts w:ascii="Arial" w:cs="Arial" w:eastAsia="Arial" w:hAnsi="Arial"/>
+                <w:b w:val="false"/>
+                <w:bCs w:val="false"/>
+                <w:i w:val="false"/>
+                <w:iCs w:val="false"/>
+                <w:color w:val="1A1A1A"/>
+                <w:sz w:val="19"/>
+                <w:szCs w:val="19"/>
+              </w:rPr>
+            </w:r>
+          </w:p>
+        </w:tc>
+        <w:tc>
+          <w:tcPr>
+            <w:tcW w:type="dxa" w:w="1800"/>
+            <w:tcBorders>
+              <w:top w:val="single" w:color="C5CDD4" w:sz="1"/>
+              <w:left w:val="single" w:color="C5CDD4" w:sz="1"/>
+              <w:bottom w:val="single" w:color="C5CDD4" w:sz="1"/>
+              <w:right w:val="single" w:color="C5CDD4" w:sz="1"/>
+            </w:tcBorders>
+            <w:tcMar>
+              <w:top w:type="dxa" w:w="50"/>
+              <w:left w:type="dxa" w:w="80"/>
+              <w:bottom w:type="dxa" w:w="50"/>
+              <w:right w:type="dxa" w:w="80"/>
+            </w:tcMar>
+          </w:tcPr>
+          <w:p>
+            <w:pPr>
+              <w:spacing w:after="15" w:before="15"/>
+              <w:jc w:val="center"/>
+            </w:pPr>
+            <w:r>
+              <w:rPr>
+                <w:rFonts w:ascii="Arial" w:cs="Arial" w:eastAsia="Arial" w:hAnsi="Arial"/>
+                <w:b w:val="false"/>
+                <w:bCs w:val="false"/>
+                <w:i w:val="false"/>
+                <w:iCs w:val="false"/>
+                <w:color w:val="1A1A1A"/>
+                <w:sz w:val="19"/>
+                <w:szCs w:val="19"/>
+              </w:rPr>
             </w:r>
           </w:p>
         </w:tc>
@@ -6297,7 +6287,6 @@
                 <w:sz w:val="19"/>
                 <w:szCs w:val="19"/>
               </w:rPr>
-              <w:t>12</w:t>
             </w:r>
           </w:p>
         </w:tc>
@@ -6333,7 +6322,6 @@
                 <w:sz w:val="17"/>
                 <w:szCs w:val="17"/>
               </w:rPr>
-              <w:t>Surplus carrot chips</w:t>
             </w:r>
           </w:p>
         </w:tc>
@@ -6633,7 +6621,7 @@
                 <w:sz w:val="18"/>
                 <w:szCs w:val="18"/>
               </w:rPr>
-              <w:t>9</w:t>
+              <w:t>6</w:t>
             </w:r>
           </w:p>
         </w:tc>
@@ -6670,7 +6658,7 @@
                 <w:sz w:val="18"/>
                 <w:szCs w:val="18"/>
               </w:rPr>
-              <w:t>14</w:t>
+              <w:t>11</w:t>
             </w:r>
           </w:p>
         </w:tc>
@@ -6707,7 +6695,7 @@
                 <w:sz w:val="18"/>
                 <w:szCs w:val="18"/>
               </w:rPr>
-              <w:t>18</w:t>
+              <w:t>12</w:t>
             </w:r>
           </w:p>
         </w:tc>
@@ -6744,7 +6732,7 @@
                 <w:sz w:val="18"/>
                 <w:szCs w:val="18"/>
               </w:rPr>
-              <w:t>41</w:t>
+              <w:t>29</w:t>
             </w:r>
           </w:p>
         </w:tc>
@@ -6857,115 +6845,111 @@
                 <w:sz w:val="19"/>
                 <w:szCs w:val="19"/>
               </w:rPr>
-              <w:t>Sweet Potato Pie Parfait</w:t>
-            </w:r>
-          </w:p>
-        </w:tc>
-        <w:tc>
-          <w:tcPr>
-            <w:tcW w:type="dxa" w:w="1800"/>
-            <w:tcBorders>
-              <w:top w:val="single" w:color="C5CDD4" w:sz="1"/>
-              <w:left w:val="single" w:color="C5CDD4" w:sz="1"/>
-              <w:bottom w:val="single" w:color="C5CDD4" w:sz="1"/>
-              <w:right w:val="single" w:color="C5CDD4" w:sz="1"/>
-            </w:tcBorders>
-            <w:tcMar>
-              <w:top w:type="dxa" w:w="50"/>
-              <w:left w:type="dxa" w:w="80"/>
-              <w:bottom w:type="dxa" w:w="50"/>
-              <w:right w:type="dxa" w:w="80"/>
-            </w:tcMar>
-          </w:tcPr>
-          <w:p>
-            <w:pPr>
-              <w:spacing w:after="15" w:before="15"/>
-              <w:jc w:val="center"/>
-            </w:pPr>
-            <w:r>
-              <w:rPr>
-                <w:rFonts w:ascii="Arial" w:cs="Arial" w:eastAsia="Arial" w:hAnsi="Arial"/>
-                <w:b w:val="false"/>
-                <w:bCs w:val="false"/>
-                <w:i w:val="false"/>
-                <w:iCs w:val="false"/>
-                <w:color w:val="1A1A1A"/>
-                <w:sz w:val="19"/>
-                <w:szCs w:val="19"/>
-              </w:rPr>
-              <w:t>2</w:t>
-            </w:r>
-          </w:p>
-        </w:tc>
-        <w:tc>
-          <w:tcPr>
-            <w:tcW w:type="dxa" w:w="1800"/>
-            <w:tcBorders>
-              <w:top w:val="single" w:color="C5CDD4" w:sz="1"/>
-              <w:left w:val="single" w:color="C5CDD4" w:sz="1"/>
-              <w:bottom w:val="single" w:color="C5CDD4" w:sz="1"/>
-              <w:right w:val="single" w:color="C5CDD4" w:sz="1"/>
-            </w:tcBorders>
-            <w:tcMar>
-              <w:top w:type="dxa" w:w="50"/>
-              <w:left w:type="dxa" w:w="80"/>
-              <w:bottom w:type="dxa" w:w="50"/>
-              <w:right w:type="dxa" w:w="80"/>
-            </w:tcMar>
-          </w:tcPr>
-          <w:p>
-            <w:pPr>
-              <w:spacing w:after="15" w:before="15"/>
-              <w:jc w:val="center"/>
-            </w:pPr>
-            <w:r>
-              <w:rPr>
-                <w:rFonts w:ascii="Arial" w:cs="Arial" w:eastAsia="Arial" w:hAnsi="Arial"/>
-                <w:b w:val="false"/>
-                <w:bCs w:val="false"/>
-                <w:i w:val="false"/>
-                <w:iCs w:val="false"/>
-                <w:color w:val="1A1A1A"/>
-                <w:sz w:val="19"/>
-                <w:szCs w:val="19"/>
-              </w:rPr>
-              <w:t>3</w:t>
-            </w:r>
-          </w:p>
-        </w:tc>
-        <w:tc>
-          <w:tcPr>
-            <w:tcW w:type="dxa" w:w="1800"/>
-            <w:tcBorders>
-              <w:top w:val="single" w:color="C5CDD4" w:sz="1"/>
-              <w:left w:val="single" w:color="C5CDD4" w:sz="1"/>
-              <w:bottom w:val="single" w:color="C5CDD4" w:sz="1"/>
-              <w:right w:val="single" w:color="C5CDD4" w:sz="1"/>
-            </w:tcBorders>
-            <w:tcMar>
-              <w:top w:type="dxa" w:w="50"/>
-              <w:left w:type="dxa" w:w="80"/>
-              <w:bottom w:type="dxa" w:w="50"/>
-              <w:right w:type="dxa" w:w="80"/>
-            </w:tcMar>
-          </w:tcPr>
-          <w:p>
-            <w:pPr>
-              <w:spacing w:after="15" w:before="15"/>
-              <w:jc w:val="center"/>
-            </w:pPr>
-            <w:r>
-              <w:rPr>
-                <w:rFonts w:ascii="Arial" w:cs="Arial" w:eastAsia="Arial" w:hAnsi="Arial"/>
-                <w:b w:val="false"/>
-                <w:bCs w:val="false"/>
-                <w:i w:val="false"/>
-                <w:iCs w:val="false"/>
-                <w:color w:val="1A1A1A"/>
-                <w:sz w:val="19"/>
-                <w:szCs w:val="19"/>
-              </w:rPr>
-              <w:t>0</w:t>
+            </w:r>
+          </w:p>
+        </w:tc>
+        <w:tc>
+          <w:tcPr>
+            <w:tcW w:type="dxa" w:w="1800"/>
+            <w:tcBorders>
+              <w:top w:val="single" w:color="C5CDD4" w:sz="1"/>
+              <w:left w:val="single" w:color="C5CDD4" w:sz="1"/>
+              <w:bottom w:val="single" w:color="C5CDD4" w:sz="1"/>
+              <w:right w:val="single" w:color="C5CDD4" w:sz="1"/>
+            </w:tcBorders>
+            <w:tcMar>
+              <w:top w:type="dxa" w:w="50"/>
+              <w:left w:type="dxa" w:w="80"/>
+              <w:bottom w:type="dxa" w:w="50"/>
+              <w:right w:type="dxa" w:w="80"/>
+            </w:tcMar>
+          </w:tcPr>
+          <w:p>
+            <w:pPr>
+              <w:spacing w:after="15" w:before="15"/>
+              <w:jc w:val="center"/>
+            </w:pPr>
+            <w:r>
+              <w:rPr>
+                <w:rFonts w:ascii="Arial" w:cs="Arial" w:eastAsia="Arial" w:hAnsi="Arial"/>
+                <w:b w:val="false"/>
+                <w:bCs w:val="false"/>
+                <w:i w:val="false"/>
+                <w:iCs w:val="false"/>
+                <w:color w:val="1A1A1A"/>
+                <w:sz w:val="19"/>
+                <w:szCs w:val="19"/>
+              </w:rPr>
+            </w:r>
+          </w:p>
+        </w:tc>
+        <w:tc>
+          <w:tcPr>
+            <w:tcW w:type="dxa" w:w="1800"/>
+            <w:tcBorders>
+              <w:top w:val="single" w:color="C5CDD4" w:sz="1"/>
+              <w:left w:val="single" w:color="C5CDD4" w:sz="1"/>
+              <w:bottom w:val="single" w:color="C5CDD4" w:sz="1"/>
+              <w:right w:val="single" w:color="C5CDD4" w:sz="1"/>
+            </w:tcBorders>
+            <w:tcMar>
+              <w:top w:type="dxa" w:w="50"/>
+              <w:left w:type="dxa" w:w="80"/>
+              <w:bottom w:type="dxa" w:w="50"/>
+              <w:right w:type="dxa" w:w="80"/>
+            </w:tcMar>
+          </w:tcPr>
+          <w:p>
+            <w:pPr>
+              <w:spacing w:after="15" w:before="15"/>
+              <w:jc w:val="center"/>
+            </w:pPr>
+            <w:r>
+              <w:rPr>
+                <w:rFonts w:ascii="Arial" w:cs="Arial" w:eastAsia="Arial" w:hAnsi="Arial"/>
+                <w:b w:val="false"/>
+                <w:bCs w:val="false"/>
+                <w:i w:val="false"/>
+                <w:iCs w:val="false"/>
+                <w:color w:val="1A1A1A"/>
+                <w:sz w:val="19"/>
+                <w:szCs w:val="19"/>
+              </w:rPr>
+            </w:r>
+          </w:p>
+        </w:tc>
+        <w:tc>
+          <w:tcPr>
+            <w:tcW w:type="dxa" w:w="1800"/>
+            <w:tcBorders>
+              <w:top w:val="single" w:color="C5CDD4" w:sz="1"/>
+              <w:left w:val="single" w:color="C5CDD4" w:sz="1"/>
+              <w:bottom w:val="single" w:color="C5CDD4" w:sz="1"/>
+              <w:right w:val="single" w:color="C5CDD4" w:sz="1"/>
+            </w:tcBorders>
+            <w:tcMar>
+              <w:top w:type="dxa" w:w="50"/>
+              <w:left w:type="dxa" w:w="80"/>
+              <w:bottom w:type="dxa" w:w="50"/>
+              <w:right w:type="dxa" w:w="80"/>
+            </w:tcMar>
+          </w:tcPr>
+          <w:p>
+            <w:pPr>
+              <w:spacing w:after="15" w:before="15"/>
+              <w:jc w:val="center"/>
+            </w:pPr>
+            <w:r>
+              <w:rPr>
+                <w:rFonts w:ascii="Arial" w:cs="Arial" w:eastAsia="Arial" w:hAnsi="Arial"/>
+                <w:b w:val="false"/>
+                <w:bCs w:val="false"/>
+                <w:i w:val="false"/>
+                <w:iCs w:val="false"/>
+                <w:color w:val="1A1A1A"/>
+                <w:sz w:val="19"/>
+                <w:szCs w:val="19"/>
+              </w:rPr>
             </w:r>
           </w:p>
         </w:tc>
@@ -7001,7 +6985,6 @@
                 <w:sz w:val="19"/>
                 <w:szCs w:val="19"/>
               </w:rPr>
-              <w:t>5</w:t>
             </w:r>
           </w:p>
         </w:tc>
@@ -7037,7 +7020,6 @@
                 <w:sz w:val="17"/>
                 <w:szCs w:val="17"/>
               </w:rPr>
-              <w:t>Surplus sweet potatoes</w:t>
             </w:r>
           </w:p>
         </w:tc>
@@ -7555,7 +7537,7 @@
                 <w:sz w:val="18"/>
                 <w:szCs w:val="18"/>
               </w:rPr>
-              <w:t>2</w:t>
+              <w:t>0</w:t>
             </w:r>
           </w:p>
         </w:tc>
@@ -7592,7 +7574,7 @@
                 <w:sz w:val="18"/>
                 <w:szCs w:val="18"/>
               </w:rPr>
-              <w:t>3</w:t>
+              <w:t>0</w:t>
             </w:r>
           </w:p>
         </w:tc>
@@ -7666,7 +7648,7 @@
                 <w:sz w:val="18"/>
                 <w:szCs w:val="18"/>
               </w:rPr>
-              <w:t>5</w:t>
+              <w:t>0</w:t>
             </w:r>
           </w:p>
         </w:tc>
@@ -7779,7 +7761,7 @@
                 <w:sz w:val="22"/>
                 <w:szCs w:val="22"/>
               </w:rPr>
-              <w:t>38</w:t>
+              <w:t>31</w:t>
             </w:r>
           </w:p>
         </w:tc>
@@ -7816,7 +7798,7 @@
                 <w:sz w:val="22"/>
                 <w:szCs w:val="22"/>
               </w:rPr>
-              <w:t>57</w:t>
+              <w:t>48</w:t>
             </w:r>
           </w:p>
         </w:tc>
@@ -7853,7 +7835,7 @@
                 <w:sz w:val="22"/>
                 <w:szCs w:val="22"/>
               </w:rPr>
-              <w:t>63</w:t>
+              <w:t>57</w:t>
             </w:r>
           </w:p>
         </w:tc>
@@ -7890,7 +7872,7 @@
                 <w:sz w:val="22"/>
                 <w:szCs w:val="22"/>
               </w:rPr>
-              <w:t>158</w:t>
+              <w:t>135</w:t>
             </w:r>
           </w:p>
         </w:tc>

</xml_diff>

<commit_message>
Add Potato Breakfast Taco as weekly staple alongside Hash Brown Bowl
Breakfast tacos (bacon, sausage, potato) are standing weekly orders:
- New Caney Monday PM: 5 each (15 total)
- Conroe Friday AM: 15 each (45 total)
Loaded Hash Brown Breakfast Bowl added as separate surplus-driven item.

https://claude.ai/code/session_01RoU8RfG3RfKf7Zo4boqHgn
</commit_message>
<xml_diff>
--- a/CC_GrabAndGo_Week12_Partner_v1.docx
+++ b/CC_GrabAndGo_Week12_Partner_v1.docx
@@ -1133,7 +1133,7 @@
                 <w:sz w:val="19"/>
                 <w:szCs w:val="19"/>
               </w:rPr>
-              <w:t>Loaded Hash Brown Breakfast Bowl</w:t>
+              <w:t>Potato Breakfast Taco w/ 2 oz Salsa</w:t>
             </w:r>
           </w:p>
         </w:tc>
@@ -1313,7 +1313,7 @@
                 <w:sz w:val="17"/>
                 <w:szCs w:val="17"/>
               </w:rPr>
-              <w:t>Surplus hash browns</w:t>
+              <w:t>Weekly staple</w:t>
             </w:r>
           </w:p>
         </w:tc>
@@ -1352,7 +1352,7 @@
                 <w:sz w:val="19"/>
                 <w:szCs w:val="19"/>
               </w:rPr>
-              <w:t xml:space="preserve">Fruit Bowl</w:t>
+              <w:t>Loaded Hash Brown Breakfast Bowl</w:t>
             </w:r>
           </w:p>
         </w:tc>
@@ -1389,7 +1389,7 @@
                 <w:sz w:val="19"/>
                 <w:szCs w:val="19"/>
               </w:rPr>
-              <w:t xml:space="preserve">0</w:t>
+              <w:t>5</w:t>
             </w:r>
           </w:p>
         </w:tc>
@@ -1426,7 +1426,7 @@
                 <w:sz w:val="19"/>
                 <w:szCs w:val="19"/>
               </w:rPr>
-              <w:t xml:space="preserve">3</w:t>
+              <w:t>5</w:t>
             </w:r>
           </w:p>
         </w:tc>
@@ -1463,7 +1463,7 @@
                 <w:sz w:val="19"/>
                 <w:szCs w:val="19"/>
               </w:rPr>
-              <w:t xml:space="preserve">0</w:t>
+              <w:t>15</w:t>
             </w:r>
           </w:p>
         </w:tc>
@@ -1500,7 +1500,7 @@
                 <w:sz w:val="19"/>
                 <w:szCs w:val="19"/>
               </w:rPr>
-              <w:t xml:space="preserve">3</w:t>
+              <w:t>25</w:t>
             </w:r>
           </w:p>
         </w:tc>
@@ -1537,7 +1537,7 @@
                 <w:sz w:val="17"/>
                 <w:szCs w:val="17"/>
               </w:rPr>
-              <w:t xml:space="preserve"/>
+              <w:t>Surplus hash browns</w:t>
             </w:r>
           </w:p>
         </w:tc>
@@ -1575,115 +1575,115 @@
                 <w:sz w:val="19"/>
                 <w:szCs w:val="19"/>
               </w:rPr>
-              <w:t xml:space="preserve"/>
-            </w:r>
-          </w:p>
-        </w:tc>
-        <w:tc>
-          <w:tcPr>
-            <w:tcW w:type="dxa" w:w="1800"/>
-            <w:tcBorders>
-              <w:top w:val="single" w:color="C5CDD4" w:sz="1"/>
-              <w:left w:val="single" w:color="C5CDD4" w:sz="1"/>
-              <w:bottom w:val="single" w:color="C5CDD4" w:sz="1"/>
-              <w:right w:val="single" w:color="C5CDD4" w:sz="1"/>
-            </w:tcBorders>
-            <w:tcMar>
-              <w:top w:type="dxa" w:w="50"/>
-              <w:left w:type="dxa" w:w="80"/>
-              <w:bottom w:type="dxa" w:w="50"/>
-              <w:right w:type="dxa" w:w="80"/>
-            </w:tcMar>
-          </w:tcPr>
-          <w:p>
-            <w:pPr>
-              <w:spacing w:after="15" w:before="15"/>
-              <w:jc w:val="center"/>
-            </w:pPr>
-            <w:r>
-              <w:rPr>
-                <w:rFonts w:ascii="Arial" w:cs="Arial" w:eastAsia="Arial" w:hAnsi="Arial"/>
-                <w:b w:val="false"/>
-                <w:bCs w:val="false"/>
-                <w:i w:val="false"/>
-                <w:iCs w:val="false"/>
-                <w:color w:val="1A1A1A"/>
-                <w:sz w:val="19"/>
-                <w:szCs w:val="19"/>
-              </w:rPr>
-              <w:t xml:space="preserve"/>
-            </w:r>
-          </w:p>
-        </w:tc>
-        <w:tc>
-          <w:tcPr>
-            <w:tcW w:type="dxa" w:w="1800"/>
-            <w:tcBorders>
-              <w:top w:val="single" w:color="C5CDD4" w:sz="1"/>
-              <w:left w:val="single" w:color="C5CDD4" w:sz="1"/>
-              <w:bottom w:val="single" w:color="C5CDD4" w:sz="1"/>
-              <w:right w:val="single" w:color="C5CDD4" w:sz="1"/>
-            </w:tcBorders>
-            <w:tcMar>
-              <w:top w:type="dxa" w:w="50"/>
-              <w:left w:type="dxa" w:w="80"/>
-              <w:bottom w:type="dxa" w:w="50"/>
-              <w:right w:type="dxa" w:w="80"/>
-            </w:tcMar>
-          </w:tcPr>
-          <w:p>
-            <w:pPr>
-              <w:spacing w:after="15" w:before="15"/>
-              <w:jc w:val="center"/>
-            </w:pPr>
-            <w:r>
-              <w:rPr>
-                <w:rFonts w:ascii="Arial" w:cs="Arial" w:eastAsia="Arial" w:hAnsi="Arial"/>
-                <w:b w:val="false"/>
-                <w:bCs w:val="false"/>
-                <w:i w:val="false"/>
-                <w:iCs w:val="false"/>
-                <w:color w:val="1A1A1A"/>
-                <w:sz w:val="19"/>
-                <w:szCs w:val="19"/>
-              </w:rPr>
-              <w:t xml:space="preserve"/>
-            </w:r>
-          </w:p>
-        </w:tc>
-        <w:tc>
-          <w:tcPr>
-            <w:tcW w:type="dxa" w:w="1800"/>
-            <w:tcBorders>
-              <w:top w:val="single" w:color="C5CDD4" w:sz="1"/>
-              <w:left w:val="single" w:color="C5CDD4" w:sz="1"/>
-              <w:bottom w:val="single" w:color="C5CDD4" w:sz="1"/>
-              <w:right w:val="single" w:color="C5CDD4" w:sz="1"/>
-            </w:tcBorders>
-            <w:tcMar>
-              <w:top w:type="dxa" w:w="50"/>
-              <w:left w:type="dxa" w:w="80"/>
-              <w:bottom w:type="dxa" w:w="50"/>
-              <w:right w:type="dxa" w:w="80"/>
-            </w:tcMar>
-          </w:tcPr>
-          <w:p>
-            <w:pPr>
-              <w:spacing w:after="15" w:before="15"/>
-              <w:jc w:val="center"/>
-            </w:pPr>
-            <w:r>
-              <w:rPr>
-                <w:rFonts w:ascii="Arial" w:cs="Arial" w:eastAsia="Arial" w:hAnsi="Arial"/>
-                <w:b w:val="false"/>
-                <w:bCs w:val="false"/>
-                <w:i w:val="false"/>
-                <w:iCs w:val="false"/>
-                <w:color w:val="1A1A1A"/>
-                <w:sz w:val="19"/>
-                <w:szCs w:val="19"/>
-              </w:rPr>
-              <w:t xml:space="preserve"/>
+              <w:t>Fruit Bowl</w:t>
+            </w:r>
+          </w:p>
+        </w:tc>
+        <w:tc>
+          <w:tcPr>
+            <w:tcW w:type="dxa" w:w="1800"/>
+            <w:tcBorders>
+              <w:top w:val="single" w:color="C5CDD4" w:sz="1"/>
+              <w:left w:val="single" w:color="C5CDD4" w:sz="1"/>
+              <w:bottom w:val="single" w:color="C5CDD4" w:sz="1"/>
+              <w:right w:val="single" w:color="C5CDD4" w:sz="1"/>
+            </w:tcBorders>
+            <w:tcMar>
+              <w:top w:type="dxa" w:w="50"/>
+              <w:left w:type="dxa" w:w="80"/>
+              <w:bottom w:type="dxa" w:w="50"/>
+              <w:right w:type="dxa" w:w="80"/>
+            </w:tcMar>
+          </w:tcPr>
+          <w:p>
+            <w:pPr>
+              <w:spacing w:after="15" w:before="15"/>
+              <w:jc w:val="center"/>
+            </w:pPr>
+            <w:r>
+              <w:rPr>
+                <w:rFonts w:ascii="Arial" w:cs="Arial" w:eastAsia="Arial" w:hAnsi="Arial"/>
+                <w:b w:val="false"/>
+                <w:bCs w:val="false"/>
+                <w:i w:val="false"/>
+                <w:iCs w:val="false"/>
+                <w:color w:val="1A1A1A"/>
+                <w:sz w:val="19"/>
+                <w:szCs w:val="19"/>
+              </w:rPr>
+              <w:t>0</w:t>
+            </w:r>
+          </w:p>
+        </w:tc>
+        <w:tc>
+          <w:tcPr>
+            <w:tcW w:type="dxa" w:w="1800"/>
+            <w:tcBorders>
+              <w:top w:val="single" w:color="C5CDD4" w:sz="1"/>
+              <w:left w:val="single" w:color="C5CDD4" w:sz="1"/>
+              <w:bottom w:val="single" w:color="C5CDD4" w:sz="1"/>
+              <w:right w:val="single" w:color="C5CDD4" w:sz="1"/>
+            </w:tcBorders>
+            <w:tcMar>
+              <w:top w:type="dxa" w:w="50"/>
+              <w:left w:type="dxa" w:w="80"/>
+              <w:bottom w:type="dxa" w:w="50"/>
+              <w:right w:type="dxa" w:w="80"/>
+            </w:tcMar>
+          </w:tcPr>
+          <w:p>
+            <w:pPr>
+              <w:spacing w:after="15" w:before="15"/>
+              <w:jc w:val="center"/>
+            </w:pPr>
+            <w:r>
+              <w:rPr>
+                <w:rFonts w:ascii="Arial" w:cs="Arial" w:eastAsia="Arial" w:hAnsi="Arial"/>
+                <w:b w:val="false"/>
+                <w:bCs w:val="false"/>
+                <w:i w:val="false"/>
+                <w:iCs w:val="false"/>
+                <w:color w:val="1A1A1A"/>
+                <w:sz w:val="19"/>
+                <w:szCs w:val="19"/>
+              </w:rPr>
+              <w:t>3</w:t>
+            </w:r>
+          </w:p>
+        </w:tc>
+        <w:tc>
+          <w:tcPr>
+            <w:tcW w:type="dxa" w:w="1800"/>
+            <w:tcBorders>
+              <w:top w:val="single" w:color="C5CDD4" w:sz="1"/>
+              <w:left w:val="single" w:color="C5CDD4" w:sz="1"/>
+              <w:bottom w:val="single" w:color="C5CDD4" w:sz="1"/>
+              <w:right w:val="single" w:color="C5CDD4" w:sz="1"/>
+            </w:tcBorders>
+            <w:tcMar>
+              <w:top w:type="dxa" w:w="50"/>
+              <w:left w:type="dxa" w:w="80"/>
+              <w:bottom w:type="dxa" w:w="50"/>
+              <w:right w:type="dxa" w:w="80"/>
+            </w:tcMar>
+          </w:tcPr>
+          <w:p>
+            <w:pPr>
+              <w:spacing w:after="15" w:before="15"/>
+              <w:jc w:val="center"/>
+            </w:pPr>
+            <w:r>
+              <w:rPr>
+                <w:rFonts w:ascii="Arial" w:cs="Arial" w:eastAsia="Arial" w:hAnsi="Arial"/>
+                <w:b w:val="false"/>
+                <w:bCs w:val="false"/>
+                <w:i w:val="false"/>
+                <w:iCs w:val="false"/>
+                <w:color w:val="1A1A1A"/>
+                <w:sz w:val="19"/>
+                <w:szCs w:val="19"/>
+              </w:rPr>
+              <w:t>0</w:t>
             </w:r>
           </w:p>
         </w:tc>
@@ -1719,7 +1719,7 @@
                 <w:sz w:val="19"/>
                 <w:szCs w:val="19"/>
               </w:rPr>
-              <w:t xml:space="preserve"/>
+              <w:t>3</w:t>
             </w:r>
           </w:p>
         </w:tc>
@@ -1755,7 +1755,6 @@
                 <w:sz w:val="17"/>
                 <w:szCs w:val="17"/>
               </w:rPr>
-              <w:t xml:space="preserve"/>
             </w:r>
           </w:p>
         </w:tc>
@@ -2055,7 +2054,7 @@
                 <w:sz w:val="18"/>
                 <w:szCs w:val="18"/>
               </w:rPr>
-              <w:t>15</w:t>
+              <w:t>20</w:t>
             </w:r>
           </w:p>
         </w:tc>
@@ -2092,7 +2091,7 @@
                 <w:sz w:val="18"/>
                 <w:szCs w:val="18"/>
               </w:rPr>
-              <w:t>18</w:t>
+              <w:t>23</w:t>
             </w:r>
           </w:p>
         </w:tc>
@@ -2129,7 +2128,7 @@
                 <w:sz w:val="18"/>
                 <w:szCs w:val="18"/>
               </w:rPr>
-              <w:t>45</w:t>
+              <w:t>60</w:t>
             </w:r>
           </w:p>
         </w:tc>
@@ -2166,7 +2165,7 @@
                 <w:sz w:val="18"/>
                 <w:szCs w:val="18"/>
               </w:rPr>
-              <w:t>78</w:t>
+              <w:t>103</w:t>
             </w:r>
           </w:p>
         </w:tc>
@@ -7761,7 +7760,7 @@
                 <w:sz w:val="22"/>
                 <w:szCs w:val="22"/>
               </w:rPr>
-              <w:t>31</w:t>
+              <w:t>36</w:t>
             </w:r>
           </w:p>
         </w:tc>
@@ -7798,7 +7797,7 @@
                 <w:sz w:val="22"/>
                 <w:szCs w:val="22"/>
               </w:rPr>
-              <w:t>48</w:t>
+              <w:t>52</w:t>
             </w:r>
           </w:p>
         </w:tc>
@@ -7835,7 +7834,7 @@
                 <w:sz w:val="22"/>
                 <w:szCs w:val="22"/>
               </w:rPr>
-              <w:t>57</w:t>
+              <w:t>72</w:t>
             </w:r>
           </w:p>
         </w:tc>
@@ -7872,7 +7871,7 @@
                 <w:sz w:val="22"/>
                 <w:szCs w:val="22"/>
               </w:rPr>
-              <w:t>135</w:t>
+              <w:t>160</w:t>
             </w:r>
           </w:p>
         </w:tc>

</xml_diff>

<commit_message>
Add variety across all menu categories
New items added:
- Salads: Southwest Chicken Salad, Garden Side Salad w/ Ranch
- Wraps: Chicken Caesar Wrap, Turkey & Swiss on Sourdough
- Bowls: Mac & Cheese Bowl
- Misc: Chips & Salsa Cup
- Parfaits: Blueberry Granola Parfait, Sweet Potato Cinnamon Parfait

Total units increased from 160 to 205.

https://claude.ai/code/session_01RoU8RfG3RfKf7Zo4boqHgn
</commit_message>
<xml_diff>
--- a/CC_GrabAndGo_Week12_Partner_v1.docx
+++ b/CC_GrabAndGo_Week12_Partner_v1.docx
@@ -2497,7 +2497,7 @@
                 <w:sz w:val="19"/>
                 <w:szCs w:val="19"/>
               </w:rPr>
-              <w:t xml:space="preserve"/>
+              <w:t>Southwest Chicken Salad</w:t>
             </w:r>
           </w:p>
         </w:tc>
@@ -2534,7 +2534,7 @@
                 <w:sz w:val="19"/>
                 <w:szCs w:val="19"/>
               </w:rPr>
-              <w:t xml:space="preserve"/>
+              <w:t>2</w:t>
             </w:r>
           </w:p>
         </w:tc>
@@ -2571,7 +2571,7 @@
                 <w:sz w:val="19"/>
                 <w:szCs w:val="19"/>
               </w:rPr>
-              <w:t xml:space="preserve"/>
+              <w:t>3</w:t>
             </w:r>
           </w:p>
         </w:tc>
@@ -2608,7 +2608,7 @@
                 <w:sz w:val="19"/>
                 <w:szCs w:val="19"/>
               </w:rPr>
-              <w:t xml:space="preserve"/>
+              <w:t>0</w:t>
             </w:r>
           </w:p>
         </w:tc>
@@ -2645,7 +2645,7 @@
                 <w:sz w:val="19"/>
                 <w:szCs w:val="19"/>
               </w:rPr>
-              <w:t xml:space="preserve"/>
+              <w:t>5</w:t>
             </w:r>
           </w:p>
         </w:tc>
@@ -2682,7 +2682,6 @@
                 <w:sz w:val="17"/>
                 <w:szCs w:val="17"/>
               </w:rPr>
-              <w:t xml:space="preserve"/>
             </w:r>
           </w:p>
         </w:tc>
@@ -2720,115 +2719,115 @@
                 <w:sz w:val="19"/>
                 <w:szCs w:val="19"/>
               </w:rPr>
-              <w:t xml:space="preserve"/>
-            </w:r>
-          </w:p>
-        </w:tc>
-        <w:tc>
-          <w:tcPr>
-            <w:tcW w:type="dxa" w:w="1800"/>
-            <w:tcBorders>
-              <w:top w:val="single" w:color="C5CDD4" w:sz="1"/>
-              <w:left w:val="single" w:color="C5CDD4" w:sz="1"/>
-              <w:bottom w:val="single" w:color="C5CDD4" w:sz="1"/>
-              <w:right w:val="single" w:color="C5CDD4" w:sz="1"/>
-            </w:tcBorders>
-            <w:tcMar>
-              <w:top w:type="dxa" w:w="50"/>
-              <w:left w:type="dxa" w:w="80"/>
-              <w:bottom w:type="dxa" w:w="50"/>
-              <w:right w:type="dxa" w:w="80"/>
-            </w:tcMar>
-          </w:tcPr>
-          <w:p>
-            <w:pPr>
-              <w:spacing w:after="15" w:before="15"/>
-              <w:jc w:val="center"/>
-            </w:pPr>
-            <w:r>
-              <w:rPr>
-                <w:rFonts w:ascii="Arial" w:cs="Arial" w:eastAsia="Arial" w:hAnsi="Arial"/>
-                <w:b w:val="false"/>
-                <w:bCs w:val="false"/>
-                <w:i w:val="false"/>
-                <w:iCs w:val="false"/>
-                <w:color w:val="1A1A1A"/>
-                <w:sz w:val="19"/>
-                <w:szCs w:val="19"/>
-              </w:rPr>
-              <w:t xml:space="preserve"/>
-            </w:r>
-          </w:p>
-        </w:tc>
-        <w:tc>
-          <w:tcPr>
-            <w:tcW w:type="dxa" w:w="1800"/>
-            <w:tcBorders>
-              <w:top w:val="single" w:color="C5CDD4" w:sz="1"/>
-              <w:left w:val="single" w:color="C5CDD4" w:sz="1"/>
-              <w:bottom w:val="single" w:color="C5CDD4" w:sz="1"/>
-              <w:right w:val="single" w:color="C5CDD4" w:sz="1"/>
-            </w:tcBorders>
-            <w:tcMar>
-              <w:top w:type="dxa" w:w="50"/>
-              <w:left w:type="dxa" w:w="80"/>
-              <w:bottom w:type="dxa" w:w="50"/>
-              <w:right w:type="dxa" w:w="80"/>
-            </w:tcMar>
-          </w:tcPr>
-          <w:p>
-            <w:pPr>
-              <w:spacing w:after="15" w:before="15"/>
-              <w:jc w:val="center"/>
-            </w:pPr>
-            <w:r>
-              <w:rPr>
-                <w:rFonts w:ascii="Arial" w:cs="Arial" w:eastAsia="Arial" w:hAnsi="Arial"/>
-                <w:b w:val="false"/>
-                <w:bCs w:val="false"/>
-                <w:i w:val="false"/>
-                <w:iCs w:val="false"/>
-                <w:color w:val="1A1A1A"/>
-                <w:sz w:val="19"/>
-                <w:szCs w:val="19"/>
-              </w:rPr>
-              <w:t xml:space="preserve"/>
-            </w:r>
-          </w:p>
-        </w:tc>
-        <w:tc>
-          <w:tcPr>
-            <w:tcW w:type="dxa" w:w="1800"/>
-            <w:tcBorders>
-              <w:top w:val="single" w:color="C5CDD4" w:sz="1"/>
-              <w:left w:val="single" w:color="C5CDD4" w:sz="1"/>
-              <w:bottom w:val="single" w:color="C5CDD4" w:sz="1"/>
-              <w:right w:val="single" w:color="C5CDD4" w:sz="1"/>
-            </w:tcBorders>
-            <w:tcMar>
-              <w:top w:type="dxa" w:w="50"/>
-              <w:left w:type="dxa" w:w="80"/>
-              <w:bottom w:type="dxa" w:w="50"/>
-              <w:right w:type="dxa" w:w="80"/>
-            </w:tcMar>
-          </w:tcPr>
-          <w:p>
-            <w:pPr>
-              <w:spacing w:after="15" w:before="15"/>
-              <w:jc w:val="center"/>
-            </w:pPr>
-            <w:r>
-              <w:rPr>
-                <w:rFonts w:ascii="Arial" w:cs="Arial" w:eastAsia="Arial" w:hAnsi="Arial"/>
-                <w:b w:val="false"/>
-                <w:bCs w:val="false"/>
-                <w:i w:val="false"/>
-                <w:iCs w:val="false"/>
-                <w:color w:val="1A1A1A"/>
-                <w:sz w:val="19"/>
-                <w:szCs w:val="19"/>
-              </w:rPr>
-              <w:t xml:space="preserve"/>
+              <w:t>Garden Side Salad w/ Ranch</w:t>
+            </w:r>
+          </w:p>
+        </w:tc>
+        <w:tc>
+          <w:tcPr>
+            <w:tcW w:type="dxa" w:w="1800"/>
+            <w:tcBorders>
+              <w:top w:val="single" w:color="C5CDD4" w:sz="1"/>
+              <w:left w:val="single" w:color="C5CDD4" w:sz="1"/>
+              <w:bottom w:val="single" w:color="C5CDD4" w:sz="1"/>
+              <w:right w:val="single" w:color="C5CDD4" w:sz="1"/>
+            </w:tcBorders>
+            <w:tcMar>
+              <w:top w:type="dxa" w:w="50"/>
+              <w:left w:type="dxa" w:w="80"/>
+              <w:bottom w:type="dxa" w:w="50"/>
+              <w:right w:type="dxa" w:w="80"/>
+            </w:tcMar>
+          </w:tcPr>
+          <w:p>
+            <w:pPr>
+              <w:spacing w:after="15" w:before="15"/>
+              <w:jc w:val="center"/>
+            </w:pPr>
+            <w:r>
+              <w:rPr>
+                <w:rFonts w:ascii="Arial" w:cs="Arial" w:eastAsia="Arial" w:hAnsi="Arial"/>
+                <w:b w:val="false"/>
+                <w:bCs w:val="false"/>
+                <w:i w:val="false"/>
+                <w:iCs w:val="false"/>
+                <w:color w:val="1A1A1A"/>
+                <w:sz w:val="19"/>
+                <w:szCs w:val="19"/>
+              </w:rPr>
+              <w:t>2</w:t>
+            </w:r>
+          </w:p>
+        </w:tc>
+        <w:tc>
+          <w:tcPr>
+            <w:tcW w:type="dxa" w:w="1800"/>
+            <w:tcBorders>
+              <w:top w:val="single" w:color="C5CDD4" w:sz="1"/>
+              <w:left w:val="single" w:color="C5CDD4" w:sz="1"/>
+              <w:bottom w:val="single" w:color="C5CDD4" w:sz="1"/>
+              <w:right w:val="single" w:color="C5CDD4" w:sz="1"/>
+            </w:tcBorders>
+            <w:tcMar>
+              <w:top w:type="dxa" w:w="50"/>
+              <w:left w:type="dxa" w:w="80"/>
+              <w:bottom w:type="dxa" w:w="50"/>
+              <w:right w:type="dxa" w:w="80"/>
+            </w:tcMar>
+          </w:tcPr>
+          <w:p>
+            <w:pPr>
+              <w:spacing w:after="15" w:before="15"/>
+              <w:jc w:val="center"/>
+            </w:pPr>
+            <w:r>
+              <w:rPr>
+                <w:rFonts w:ascii="Arial" w:cs="Arial" w:eastAsia="Arial" w:hAnsi="Arial"/>
+                <w:b w:val="false"/>
+                <w:bCs w:val="false"/>
+                <w:i w:val="false"/>
+                <w:iCs w:val="false"/>
+                <w:color w:val="1A1A1A"/>
+                <w:sz w:val="19"/>
+                <w:szCs w:val="19"/>
+              </w:rPr>
+              <w:t>2</w:t>
+            </w:r>
+          </w:p>
+        </w:tc>
+        <w:tc>
+          <w:tcPr>
+            <w:tcW w:type="dxa" w:w="1800"/>
+            <w:tcBorders>
+              <w:top w:val="single" w:color="C5CDD4" w:sz="1"/>
+              <w:left w:val="single" w:color="C5CDD4" w:sz="1"/>
+              <w:bottom w:val="single" w:color="C5CDD4" w:sz="1"/>
+              <w:right w:val="single" w:color="C5CDD4" w:sz="1"/>
+            </w:tcBorders>
+            <w:tcMar>
+              <w:top w:type="dxa" w:w="50"/>
+              <w:left w:type="dxa" w:w="80"/>
+              <w:bottom w:type="dxa" w:w="50"/>
+              <w:right w:type="dxa" w:w="80"/>
+            </w:tcMar>
+          </w:tcPr>
+          <w:p>
+            <w:pPr>
+              <w:spacing w:after="15" w:before="15"/>
+              <w:jc w:val="center"/>
+            </w:pPr>
+            <w:r>
+              <w:rPr>
+                <w:rFonts w:ascii="Arial" w:cs="Arial" w:eastAsia="Arial" w:hAnsi="Arial"/>
+                <w:b w:val="false"/>
+                <w:bCs w:val="false"/>
+                <w:i w:val="false"/>
+                <w:iCs w:val="false"/>
+                <w:color w:val="1A1A1A"/>
+                <w:sz w:val="19"/>
+                <w:szCs w:val="19"/>
+              </w:rPr>
+              <w:t>0</w:t>
             </w:r>
           </w:p>
         </w:tc>
@@ -2864,7 +2863,7 @@
                 <w:sz w:val="19"/>
                 <w:szCs w:val="19"/>
               </w:rPr>
-              <w:t xml:space="preserve"/>
+              <w:t>4</w:t>
             </w:r>
           </w:p>
         </w:tc>
@@ -2900,7 +2899,6 @@
                 <w:sz w:val="17"/>
                 <w:szCs w:val="17"/>
               </w:rPr>
-              <w:t xml:space="preserve"/>
             </w:r>
           </w:p>
         </w:tc>
@@ -2976,7 +2974,7 @@
                 <w:sz w:val="18"/>
                 <w:szCs w:val="18"/>
               </w:rPr>
-              <w:t>2</w:t>
+              <w:t>6</w:t>
             </w:r>
           </w:p>
         </w:tc>
@@ -3013,7 +3011,7 @@
                 <w:sz w:val="18"/>
                 <w:szCs w:val="18"/>
               </w:rPr>
-              <w:t>3</w:t>
+              <w:t>8</w:t>
             </w:r>
           </w:p>
         </w:tc>
@@ -3087,7 +3085,7 @@
                 <w:sz w:val="18"/>
                 <w:szCs w:val="18"/>
               </w:rPr>
-              <w:t>5</w:t>
+              <w:t>14</w:t>
             </w:r>
           </w:p>
         </w:tc>
@@ -3419,7 +3417,7 @@
                 <w:sz w:val="19"/>
                 <w:szCs w:val="19"/>
               </w:rPr>
-              <w:t xml:space="preserve"/>
+              <w:t>Chicken Caesar Wrap</w:t>
             </w:r>
           </w:p>
         </w:tc>
@@ -3456,7 +3454,7 @@
                 <w:sz w:val="19"/>
                 <w:szCs w:val="19"/>
               </w:rPr>
-              <w:t xml:space="preserve"/>
+              <w:t>2</w:t>
             </w:r>
           </w:p>
         </w:tc>
@@ -3493,7 +3491,7 @@
                 <w:sz w:val="19"/>
                 <w:szCs w:val="19"/>
               </w:rPr>
-              <w:t xml:space="preserve"/>
+              <w:t>3</w:t>
             </w:r>
           </w:p>
         </w:tc>
@@ -3530,7 +3528,7 @@
                 <w:sz w:val="19"/>
                 <w:szCs w:val="19"/>
               </w:rPr>
-              <w:t xml:space="preserve"/>
+              <w:t>0</w:t>
             </w:r>
           </w:p>
         </w:tc>
@@ -3567,7 +3565,7 @@
                 <w:sz w:val="19"/>
                 <w:szCs w:val="19"/>
               </w:rPr>
-              <w:t xml:space="preserve"/>
+              <w:t>5</w:t>
             </w:r>
           </w:p>
         </w:tc>
@@ -3604,7 +3602,6 @@
                 <w:sz w:val="17"/>
                 <w:szCs w:val="17"/>
               </w:rPr>
-              <w:t xml:space="preserve"/>
             </w:r>
           </w:p>
         </w:tc>
@@ -3642,115 +3639,115 @@
                 <w:sz w:val="19"/>
                 <w:szCs w:val="19"/>
               </w:rPr>
-              <w:t xml:space="preserve"/>
-            </w:r>
-          </w:p>
-        </w:tc>
-        <w:tc>
-          <w:tcPr>
-            <w:tcW w:type="dxa" w:w="1800"/>
-            <w:tcBorders>
-              <w:top w:val="single" w:color="C5CDD4" w:sz="1"/>
-              <w:left w:val="single" w:color="C5CDD4" w:sz="1"/>
-              <w:bottom w:val="single" w:color="C5CDD4" w:sz="1"/>
-              <w:right w:val="single" w:color="C5CDD4" w:sz="1"/>
-            </w:tcBorders>
-            <w:tcMar>
-              <w:top w:type="dxa" w:w="50"/>
-              <w:left w:type="dxa" w:w="80"/>
-              <w:bottom w:type="dxa" w:w="50"/>
-              <w:right w:type="dxa" w:w="80"/>
-            </w:tcMar>
-          </w:tcPr>
-          <w:p>
-            <w:pPr>
-              <w:spacing w:after="15" w:before="15"/>
-              <w:jc w:val="center"/>
-            </w:pPr>
-            <w:r>
-              <w:rPr>
-                <w:rFonts w:ascii="Arial" w:cs="Arial" w:eastAsia="Arial" w:hAnsi="Arial"/>
-                <w:b w:val="false"/>
-                <w:bCs w:val="false"/>
-                <w:i w:val="false"/>
-                <w:iCs w:val="false"/>
-                <w:color w:val="1A1A1A"/>
-                <w:sz w:val="19"/>
-                <w:szCs w:val="19"/>
-              </w:rPr>
-              <w:t xml:space="preserve"/>
-            </w:r>
-          </w:p>
-        </w:tc>
-        <w:tc>
-          <w:tcPr>
-            <w:tcW w:type="dxa" w:w="1800"/>
-            <w:tcBorders>
-              <w:top w:val="single" w:color="C5CDD4" w:sz="1"/>
-              <w:left w:val="single" w:color="C5CDD4" w:sz="1"/>
-              <w:bottom w:val="single" w:color="C5CDD4" w:sz="1"/>
-              <w:right w:val="single" w:color="C5CDD4" w:sz="1"/>
-            </w:tcBorders>
-            <w:tcMar>
-              <w:top w:type="dxa" w:w="50"/>
-              <w:left w:type="dxa" w:w="80"/>
-              <w:bottom w:type="dxa" w:w="50"/>
-              <w:right w:type="dxa" w:w="80"/>
-            </w:tcMar>
-          </w:tcPr>
-          <w:p>
-            <w:pPr>
-              <w:spacing w:after="15" w:before="15"/>
-              <w:jc w:val="center"/>
-            </w:pPr>
-            <w:r>
-              <w:rPr>
-                <w:rFonts w:ascii="Arial" w:cs="Arial" w:eastAsia="Arial" w:hAnsi="Arial"/>
-                <w:b w:val="false"/>
-                <w:bCs w:val="false"/>
-                <w:i w:val="false"/>
-                <w:iCs w:val="false"/>
-                <w:color w:val="1A1A1A"/>
-                <w:sz w:val="19"/>
-                <w:szCs w:val="19"/>
-              </w:rPr>
-              <w:t xml:space="preserve"/>
-            </w:r>
-          </w:p>
-        </w:tc>
-        <w:tc>
-          <w:tcPr>
-            <w:tcW w:type="dxa" w:w="1800"/>
-            <w:tcBorders>
-              <w:top w:val="single" w:color="C5CDD4" w:sz="1"/>
-              <w:left w:val="single" w:color="C5CDD4" w:sz="1"/>
-              <w:bottom w:val="single" w:color="C5CDD4" w:sz="1"/>
-              <w:right w:val="single" w:color="C5CDD4" w:sz="1"/>
-            </w:tcBorders>
-            <w:tcMar>
-              <w:top w:type="dxa" w:w="50"/>
-              <w:left w:type="dxa" w:w="80"/>
-              <w:bottom w:type="dxa" w:w="50"/>
-              <w:right w:type="dxa" w:w="80"/>
-            </w:tcMar>
-          </w:tcPr>
-          <w:p>
-            <w:pPr>
-              <w:spacing w:after="15" w:before="15"/>
-              <w:jc w:val="center"/>
-            </w:pPr>
-            <w:r>
-              <w:rPr>
-                <w:rFonts w:ascii="Arial" w:cs="Arial" w:eastAsia="Arial" w:hAnsi="Arial"/>
-                <w:b w:val="false"/>
-                <w:bCs w:val="false"/>
-                <w:i w:val="false"/>
-                <w:iCs w:val="false"/>
-                <w:color w:val="1A1A1A"/>
-                <w:sz w:val="19"/>
-                <w:szCs w:val="19"/>
-              </w:rPr>
-              <w:t xml:space="preserve"/>
+              <w:t>Turkey &amp; Swiss on Sourdough</w:t>
+            </w:r>
+          </w:p>
+        </w:tc>
+        <w:tc>
+          <w:tcPr>
+            <w:tcW w:type="dxa" w:w="1800"/>
+            <w:tcBorders>
+              <w:top w:val="single" w:color="C5CDD4" w:sz="1"/>
+              <w:left w:val="single" w:color="C5CDD4" w:sz="1"/>
+              <w:bottom w:val="single" w:color="C5CDD4" w:sz="1"/>
+              <w:right w:val="single" w:color="C5CDD4" w:sz="1"/>
+            </w:tcBorders>
+            <w:tcMar>
+              <w:top w:type="dxa" w:w="50"/>
+              <w:left w:type="dxa" w:w="80"/>
+              <w:bottom w:type="dxa" w:w="50"/>
+              <w:right w:type="dxa" w:w="80"/>
+            </w:tcMar>
+          </w:tcPr>
+          <w:p>
+            <w:pPr>
+              <w:spacing w:after="15" w:before="15"/>
+              <w:jc w:val="center"/>
+            </w:pPr>
+            <w:r>
+              <w:rPr>
+                <w:rFonts w:ascii="Arial" w:cs="Arial" w:eastAsia="Arial" w:hAnsi="Arial"/>
+                <w:b w:val="false"/>
+                <w:bCs w:val="false"/>
+                <w:i w:val="false"/>
+                <w:iCs w:val="false"/>
+                <w:color w:val="1A1A1A"/>
+                <w:sz w:val="19"/>
+                <w:szCs w:val="19"/>
+              </w:rPr>
+              <w:t>2</w:t>
+            </w:r>
+          </w:p>
+        </w:tc>
+        <w:tc>
+          <w:tcPr>
+            <w:tcW w:type="dxa" w:w="1800"/>
+            <w:tcBorders>
+              <w:top w:val="single" w:color="C5CDD4" w:sz="1"/>
+              <w:left w:val="single" w:color="C5CDD4" w:sz="1"/>
+              <w:bottom w:val="single" w:color="C5CDD4" w:sz="1"/>
+              <w:right w:val="single" w:color="C5CDD4" w:sz="1"/>
+            </w:tcBorders>
+            <w:tcMar>
+              <w:top w:type="dxa" w:w="50"/>
+              <w:left w:type="dxa" w:w="80"/>
+              <w:bottom w:type="dxa" w:w="50"/>
+              <w:right w:type="dxa" w:w="80"/>
+            </w:tcMar>
+          </w:tcPr>
+          <w:p>
+            <w:pPr>
+              <w:spacing w:after="15" w:before="15"/>
+              <w:jc w:val="center"/>
+            </w:pPr>
+            <w:r>
+              <w:rPr>
+                <w:rFonts w:ascii="Arial" w:cs="Arial" w:eastAsia="Arial" w:hAnsi="Arial"/>
+                <w:b w:val="false"/>
+                <w:bCs w:val="false"/>
+                <w:i w:val="false"/>
+                <w:iCs w:val="false"/>
+                <w:color w:val="1A1A1A"/>
+                <w:sz w:val="19"/>
+                <w:szCs w:val="19"/>
+              </w:rPr>
+              <w:t>2</w:t>
+            </w:r>
+          </w:p>
+        </w:tc>
+        <w:tc>
+          <w:tcPr>
+            <w:tcW w:type="dxa" w:w="1800"/>
+            <w:tcBorders>
+              <w:top w:val="single" w:color="C5CDD4" w:sz="1"/>
+              <w:left w:val="single" w:color="C5CDD4" w:sz="1"/>
+              <w:bottom w:val="single" w:color="C5CDD4" w:sz="1"/>
+              <w:right w:val="single" w:color="C5CDD4" w:sz="1"/>
+            </w:tcBorders>
+            <w:tcMar>
+              <w:top w:type="dxa" w:w="50"/>
+              <w:left w:type="dxa" w:w="80"/>
+              <w:bottom w:type="dxa" w:w="50"/>
+              <w:right w:type="dxa" w:w="80"/>
+            </w:tcMar>
+          </w:tcPr>
+          <w:p>
+            <w:pPr>
+              <w:spacing w:after="15" w:before="15"/>
+              <w:jc w:val="center"/>
+            </w:pPr>
+            <w:r>
+              <w:rPr>
+                <w:rFonts w:ascii="Arial" w:cs="Arial" w:eastAsia="Arial" w:hAnsi="Arial"/>
+                <w:b w:val="false"/>
+                <w:bCs w:val="false"/>
+                <w:i w:val="false"/>
+                <w:iCs w:val="false"/>
+                <w:color w:val="1A1A1A"/>
+                <w:sz w:val="19"/>
+                <w:szCs w:val="19"/>
+              </w:rPr>
+              <w:t>0</w:t>
             </w:r>
           </w:p>
         </w:tc>
@@ -3786,7 +3783,7 @@
                 <w:sz w:val="19"/>
                 <w:szCs w:val="19"/>
               </w:rPr>
-              <w:t xml:space="preserve"/>
+              <w:t>4</w:t>
             </w:r>
           </w:p>
         </w:tc>
@@ -3822,7 +3819,6 @@
                 <w:sz w:val="17"/>
                 <w:szCs w:val="17"/>
               </w:rPr>
-              <w:t xml:space="preserve"/>
             </w:r>
           </w:p>
         </w:tc>
@@ -3898,7 +3894,7 @@
                 <w:sz w:val="18"/>
                 <w:szCs w:val="18"/>
               </w:rPr>
-              <w:t>2</w:t>
+              <w:t>6</w:t>
             </w:r>
           </w:p>
         </w:tc>
@@ -3935,7 +3931,7 @@
                 <w:sz w:val="18"/>
                 <w:szCs w:val="18"/>
               </w:rPr>
-              <w:t>3</w:t>
+              <w:t>8</w:t>
             </w:r>
           </w:p>
         </w:tc>
@@ -4009,7 +4005,7 @@
                 <w:sz w:val="18"/>
                 <w:szCs w:val="18"/>
               </w:rPr>
-              <w:t>5</w:t>
+              <w:t>14</w:t>
             </w:r>
           </w:p>
         </w:tc>
@@ -4341,6 +4337,7 @@
                 <w:sz w:val="19"/>
                 <w:szCs w:val="19"/>
               </w:rPr>
+              <w:t>Mac &amp; Cheese Bowl</w:t>
             </w:r>
           </w:p>
         </w:tc>
@@ -4377,6 +4374,7 @@
                 <w:sz w:val="19"/>
                 <w:szCs w:val="19"/>
               </w:rPr>
+              <w:t>2</w:t>
             </w:r>
           </w:p>
         </w:tc>
@@ -4413,6 +4411,7 @@
                 <w:sz w:val="19"/>
                 <w:szCs w:val="19"/>
               </w:rPr>
+              <w:t>4</w:t>
             </w:r>
           </w:p>
         </w:tc>
@@ -4449,6 +4448,7 @@
                 <w:sz w:val="19"/>
                 <w:szCs w:val="19"/>
               </w:rPr>
+              <w:t>0</w:t>
             </w:r>
           </w:p>
         </w:tc>
@@ -4485,6 +4485,7 @@
                 <w:sz w:val="19"/>
                 <w:szCs w:val="19"/>
               </w:rPr>
+              <w:t>6</w:t>
             </w:r>
           </w:p>
         </w:tc>
@@ -5480,7 +5481,7 @@
                 <w:sz w:val="18"/>
                 <w:szCs w:val="18"/>
               </w:rPr>
-              <w:t>6</w:t>
+              <w:t>8</w:t>
             </w:r>
           </w:p>
         </w:tc>
@@ -5517,7 +5518,7 @@
                 <w:sz w:val="18"/>
                 <w:szCs w:val="18"/>
               </w:rPr>
-              <w:t>12</w:t>
+              <w:t>16</w:t>
             </w:r>
           </w:p>
         </w:tc>
@@ -5591,7 +5592,7 @@
                 <w:sz w:val="18"/>
                 <w:szCs w:val="18"/>
               </w:rPr>
-              <w:t>18</w:t>
+              <w:t>24</w:t>
             </w:r>
           </w:p>
         </w:tc>
@@ -6146,111 +6147,115 @@
                 <w:sz w:val="19"/>
                 <w:szCs w:val="19"/>
               </w:rPr>
-            </w:r>
-          </w:p>
-        </w:tc>
-        <w:tc>
-          <w:tcPr>
-            <w:tcW w:type="dxa" w:w="1800"/>
-            <w:tcBorders>
-              <w:top w:val="single" w:color="C5CDD4" w:sz="1"/>
-              <w:left w:val="single" w:color="C5CDD4" w:sz="1"/>
-              <w:bottom w:val="single" w:color="C5CDD4" w:sz="1"/>
-              <w:right w:val="single" w:color="C5CDD4" w:sz="1"/>
-            </w:tcBorders>
-            <w:tcMar>
-              <w:top w:type="dxa" w:w="50"/>
-              <w:left w:type="dxa" w:w="80"/>
-              <w:bottom w:type="dxa" w:w="50"/>
-              <w:right w:type="dxa" w:w="80"/>
-            </w:tcMar>
-          </w:tcPr>
-          <w:p>
-            <w:pPr>
-              <w:spacing w:after="15" w:before="15"/>
-              <w:jc w:val="center"/>
-            </w:pPr>
-            <w:r>
-              <w:rPr>
-                <w:rFonts w:ascii="Arial" w:cs="Arial" w:eastAsia="Arial" w:hAnsi="Arial"/>
-                <w:b w:val="false"/>
-                <w:bCs w:val="false"/>
-                <w:i w:val="false"/>
-                <w:iCs w:val="false"/>
-                <w:color w:val="1A1A1A"/>
-                <w:sz w:val="19"/>
-                <w:szCs w:val="19"/>
-              </w:rPr>
-            </w:r>
-          </w:p>
-        </w:tc>
-        <w:tc>
-          <w:tcPr>
-            <w:tcW w:type="dxa" w:w="1800"/>
-            <w:tcBorders>
-              <w:top w:val="single" w:color="C5CDD4" w:sz="1"/>
-              <w:left w:val="single" w:color="C5CDD4" w:sz="1"/>
-              <w:bottom w:val="single" w:color="C5CDD4" w:sz="1"/>
-              <w:right w:val="single" w:color="C5CDD4" w:sz="1"/>
-            </w:tcBorders>
-            <w:tcMar>
-              <w:top w:type="dxa" w:w="50"/>
-              <w:left w:type="dxa" w:w="80"/>
-              <w:bottom w:type="dxa" w:w="50"/>
-              <w:right w:type="dxa" w:w="80"/>
-            </w:tcMar>
-          </w:tcPr>
-          <w:p>
-            <w:pPr>
-              <w:spacing w:after="15" w:before="15"/>
-              <w:jc w:val="center"/>
-            </w:pPr>
-            <w:r>
-              <w:rPr>
-                <w:rFonts w:ascii="Arial" w:cs="Arial" w:eastAsia="Arial" w:hAnsi="Arial"/>
-                <w:b w:val="false"/>
-                <w:bCs w:val="false"/>
-                <w:i w:val="false"/>
-                <w:iCs w:val="false"/>
-                <w:color w:val="1A1A1A"/>
-                <w:sz w:val="19"/>
-                <w:szCs w:val="19"/>
-              </w:rPr>
-            </w:r>
-          </w:p>
-        </w:tc>
-        <w:tc>
-          <w:tcPr>
-            <w:tcW w:type="dxa" w:w="1800"/>
-            <w:tcBorders>
-              <w:top w:val="single" w:color="C5CDD4" w:sz="1"/>
-              <w:left w:val="single" w:color="C5CDD4" w:sz="1"/>
-              <w:bottom w:val="single" w:color="C5CDD4" w:sz="1"/>
-              <w:right w:val="single" w:color="C5CDD4" w:sz="1"/>
-            </w:tcBorders>
-            <w:tcMar>
-              <w:top w:type="dxa" w:w="50"/>
-              <w:left w:type="dxa" w:w="80"/>
-              <w:bottom w:type="dxa" w:w="50"/>
-              <w:right w:type="dxa" w:w="80"/>
-            </w:tcMar>
-          </w:tcPr>
-          <w:p>
-            <w:pPr>
-              <w:spacing w:after="15" w:before="15"/>
-              <w:jc w:val="center"/>
-            </w:pPr>
-            <w:r>
-              <w:rPr>
-                <w:rFonts w:ascii="Arial" w:cs="Arial" w:eastAsia="Arial" w:hAnsi="Arial"/>
-                <w:b w:val="false"/>
-                <w:bCs w:val="false"/>
-                <w:i w:val="false"/>
-                <w:iCs w:val="false"/>
-                <w:color w:val="1A1A1A"/>
-                <w:sz w:val="19"/>
-                <w:szCs w:val="19"/>
-              </w:rPr>
+              <w:t>Chips &amp; Salsa Cup</w:t>
+            </w:r>
+          </w:p>
+        </w:tc>
+        <w:tc>
+          <w:tcPr>
+            <w:tcW w:type="dxa" w:w="1800"/>
+            <w:tcBorders>
+              <w:top w:val="single" w:color="C5CDD4" w:sz="1"/>
+              <w:left w:val="single" w:color="C5CDD4" w:sz="1"/>
+              <w:bottom w:val="single" w:color="C5CDD4" w:sz="1"/>
+              <w:right w:val="single" w:color="C5CDD4" w:sz="1"/>
+            </w:tcBorders>
+            <w:tcMar>
+              <w:top w:type="dxa" w:w="50"/>
+              <w:left w:type="dxa" w:w="80"/>
+              <w:bottom w:type="dxa" w:w="50"/>
+              <w:right w:type="dxa" w:w="80"/>
+            </w:tcMar>
+          </w:tcPr>
+          <w:p>
+            <w:pPr>
+              <w:spacing w:after="15" w:before="15"/>
+              <w:jc w:val="center"/>
+            </w:pPr>
+            <w:r>
+              <w:rPr>
+                <w:rFonts w:ascii="Arial" w:cs="Arial" w:eastAsia="Arial" w:hAnsi="Arial"/>
+                <w:b w:val="false"/>
+                <w:bCs w:val="false"/>
+                <w:i w:val="false"/>
+                <w:iCs w:val="false"/>
+                <w:color w:val="1A1A1A"/>
+                <w:sz w:val="19"/>
+                <w:szCs w:val="19"/>
+              </w:rPr>
+              <w:t>3</w:t>
+            </w:r>
+          </w:p>
+        </w:tc>
+        <w:tc>
+          <w:tcPr>
+            <w:tcW w:type="dxa" w:w="1800"/>
+            <w:tcBorders>
+              <w:top w:val="single" w:color="C5CDD4" w:sz="1"/>
+              <w:left w:val="single" w:color="C5CDD4" w:sz="1"/>
+              <w:bottom w:val="single" w:color="C5CDD4" w:sz="1"/>
+              <w:right w:val="single" w:color="C5CDD4" w:sz="1"/>
+            </w:tcBorders>
+            <w:tcMar>
+              <w:top w:type="dxa" w:w="50"/>
+              <w:left w:type="dxa" w:w="80"/>
+              <w:bottom w:type="dxa" w:w="50"/>
+              <w:right w:type="dxa" w:w="80"/>
+            </w:tcMar>
+          </w:tcPr>
+          <w:p>
+            <w:pPr>
+              <w:spacing w:after="15" w:before="15"/>
+              <w:jc w:val="center"/>
+            </w:pPr>
+            <w:r>
+              <w:rPr>
+                <w:rFonts w:ascii="Arial" w:cs="Arial" w:eastAsia="Arial" w:hAnsi="Arial"/>
+                <w:b w:val="false"/>
+                <w:bCs w:val="false"/>
+                <w:i w:val="false"/>
+                <w:iCs w:val="false"/>
+                <w:color w:val="1A1A1A"/>
+                <w:sz w:val="19"/>
+                <w:szCs w:val="19"/>
+              </w:rPr>
+              <w:t>3</w:t>
+            </w:r>
+          </w:p>
+        </w:tc>
+        <w:tc>
+          <w:tcPr>
+            <w:tcW w:type="dxa" w:w="1800"/>
+            <w:tcBorders>
+              <w:top w:val="single" w:color="C5CDD4" w:sz="1"/>
+              <w:left w:val="single" w:color="C5CDD4" w:sz="1"/>
+              <w:bottom w:val="single" w:color="C5CDD4" w:sz="1"/>
+              <w:right w:val="single" w:color="C5CDD4" w:sz="1"/>
+            </w:tcBorders>
+            <w:tcMar>
+              <w:top w:type="dxa" w:w="50"/>
+              <w:left w:type="dxa" w:w="80"/>
+              <w:bottom w:type="dxa" w:w="50"/>
+              <w:right w:type="dxa" w:w="80"/>
+            </w:tcMar>
+          </w:tcPr>
+          <w:p>
+            <w:pPr>
+              <w:spacing w:after="15" w:before="15"/>
+              <w:jc w:val="center"/>
+            </w:pPr>
+            <w:r>
+              <w:rPr>
+                <w:rFonts w:ascii="Arial" w:cs="Arial" w:eastAsia="Arial" w:hAnsi="Arial"/>
+                <w:b w:val="false"/>
+                <w:bCs w:val="false"/>
+                <w:i w:val="false"/>
+                <w:iCs w:val="false"/>
+                <w:color w:val="1A1A1A"/>
+                <w:sz w:val="19"/>
+                <w:szCs w:val="19"/>
+              </w:rPr>
+              <w:t>6</w:t>
             </w:r>
           </w:p>
         </w:tc>
@@ -6286,6 +6291,7 @@
                 <w:sz w:val="19"/>
                 <w:szCs w:val="19"/>
               </w:rPr>
+              <w:t>12</w:t>
             </w:r>
           </w:p>
         </w:tc>
@@ -6620,7 +6626,7 @@
                 <w:sz w:val="18"/>
                 <w:szCs w:val="18"/>
               </w:rPr>
-              <w:t>6</w:t>
+              <w:t>9</w:t>
             </w:r>
           </w:p>
         </w:tc>
@@ -6657,7 +6663,7 @@
                 <w:sz w:val="18"/>
                 <w:szCs w:val="18"/>
               </w:rPr>
-              <w:t>11</w:t>
+              <w:t>14</w:t>
             </w:r>
           </w:p>
         </w:tc>
@@ -6694,7 +6700,7 @@
                 <w:sz w:val="18"/>
                 <w:szCs w:val="18"/>
               </w:rPr>
-              <w:t>12</w:t>
+              <w:t>18</w:t>
             </w:r>
           </w:p>
         </w:tc>
@@ -6731,7 +6737,7 @@
                 <w:sz w:val="18"/>
                 <w:szCs w:val="18"/>
               </w:rPr>
-              <w:t>29</w:t>
+              <w:t>41</w:t>
             </w:r>
           </w:p>
         </w:tc>
@@ -6844,111 +6850,115 @@
                 <w:sz w:val="19"/>
                 <w:szCs w:val="19"/>
               </w:rPr>
-            </w:r>
-          </w:p>
-        </w:tc>
-        <w:tc>
-          <w:tcPr>
-            <w:tcW w:type="dxa" w:w="1800"/>
-            <w:tcBorders>
-              <w:top w:val="single" w:color="C5CDD4" w:sz="1"/>
-              <w:left w:val="single" w:color="C5CDD4" w:sz="1"/>
-              <w:bottom w:val="single" w:color="C5CDD4" w:sz="1"/>
-              <w:right w:val="single" w:color="C5CDD4" w:sz="1"/>
-            </w:tcBorders>
-            <w:tcMar>
-              <w:top w:type="dxa" w:w="50"/>
-              <w:left w:type="dxa" w:w="80"/>
-              <w:bottom w:type="dxa" w:w="50"/>
-              <w:right w:type="dxa" w:w="80"/>
-            </w:tcMar>
-          </w:tcPr>
-          <w:p>
-            <w:pPr>
-              <w:spacing w:after="15" w:before="15"/>
-              <w:jc w:val="center"/>
-            </w:pPr>
-            <w:r>
-              <w:rPr>
-                <w:rFonts w:ascii="Arial" w:cs="Arial" w:eastAsia="Arial" w:hAnsi="Arial"/>
-                <w:b w:val="false"/>
-                <w:bCs w:val="false"/>
-                <w:i w:val="false"/>
-                <w:iCs w:val="false"/>
-                <w:color w:val="1A1A1A"/>
-                <w:sz w:val="19"/>
-                <w:szCs w:val="19"/>
-              </w:rPr>
-            </w:r>
-          </w:p>
-        </w:tc>
-        <w:tc>
-          <w:tcPr>
-            <w:tcW w:type="dxa" w:w="1800"/>
-            <w:tcBorders>
-              <w:top w:val="single" w:color="C5CDD4" w:sz="1"/>
-              <w:left w:val="single" w:color="C5CDD4" w:sz="1"/>
-              <w:bottom w:val="single" w:color="C5CDD4" w:sz="1"/>
-              <w:right w:val="single" w:color="C5CDD4" w:sz="1"/>
-            </w:tcBorders>
-            <w:tcMar>
-              <w:top w:type="dxa" w:w="50"/>
-              <w:left w:type="dxa" w:w="80"/>
-              <w:bottom w:type="dxa" w:w="50"/>
-              <w:right w:type="dxa" w:w="80"/>
-            </w:tcMar>
-          </w:tcPr>
-          <w:p>
-            <w:pPr>
-              <w:spacing w:after="15" w:before="15"/>
-              <w:jc w:val="center"/>
-            </w:pPr>
-            <w:r>
-              <w:rPr>
-                <w:rFonts w:ascii="Arial" w:cs="Arial" w:eastAsia="Arial" w:hAnsi="Arial"/>
-                <w:b w:val="false"/>
-                <w:bCs w:val="false"/>
-                <w:i w:val="false"/>
-                <w:iCs w:val="false"/>
-                <w:color w:val="1A1A1A"/>
-                <w:sz w:val="19"/>
-                <w:szCs w:val="19"/>
-              </w:rPr>
-            </w:r>
-          </w:p>
-        </w:tc>
-        <w:tc>
-          <w:tcPr>
-            <w:tcW w:type="dxa" w:w="1800"/>
-            <w:tcBorders>
-              <w:top w:val="single" w:color="C5CDD4" w:sz="1"/>
-              <w:left w:val="single" w:color="C5CDD4" w:sz="1"/>
-              <w:bottom w:val="single" w:color="C5CDD4" w:sz="1"/>
-              <w:right w:val="single" w:color="C5CDD4" w:sz="1"/>
-            </w:tcBorders>
-            <w:tcMar>
-              <w:top w:type="dxa" w:w="50"/>
-              <w:left w:type="dxa" w:w="80"/>
-              <w:bottom w:type="dxa" w:w="50"/>
-              <w:right w:type="dxa" w:w="80"/>
-            </w:tcMar>
-          </w:tcPr>
-          <w:p>
-            <w:pPr>
-              <w:spacing w:after="15" w:before="15"/>
-              <w:jc w:val="center"/>
-            </w:pPr>
-            <w:r>
-              <w:rPr>
-                <w:rFonts w:ascii="Arial" w:cs="Arial" w:eastAsia="Arial" w:hAnsi="Arial"/>
-                <w:b w:val="false"/>
-                <w:bCs w:val="false"/>
-                <w:i w:val="false"/>
-                <w:iCs w:val="false"/>
-                <w:color w:val="1A1A1A"/>
-                <w:sz w:val="19"/>
-                <w:szCs w:val="19"/>
-              </w:rPr>
+              <w:t>Blueberry Granola Parfait</w:t>
+            </w:r>
+          </w:p>
+        </w:tc>
+        <w:tc>
+          <w:tcPr>
+            <w:tcW w:type="dxa" w:w="1800"/>
+            <w:tcBorders>
+              <w:top w:val="single" w:color="C5CDD4" w:sz="1"/>
+              <w:left w:val="single" w:color="C5CDD4" w:sz="1"/>
+              <w:bottom w:val="single" w:color="C5CDD4" w:sz="1"/>
+              <w:right w:val="single" w:color="C5CDD4" w:sz="1"/>
+            </w:tcBorders>
+            <w:tcMar>
+              <w:top w:type="dxa" w:w="50"/>
+              <w:left w:type="dxa" w:w="80"/>
+              <w:bottom w:type="dxa" w:w="50"/>
+              <w:right w:type="dxa" w:w="80"/>
+            </w:tcMar>
+          </w:tcPr>
+          <w:p>
+            <w:pPr>
+              <w:spacing w:after="15" w:before="15"/>
+              <w:jc w:val="center"/>
+            </w:pPr>
+            <w:r>
+              <w:rPr>
+                <w:rFonts w:ascii="Arial" w:cs="Arial" w:eastAsia="Arial" w:hAnsi="Arial"/>
+                <w:b w:val="false"/>
+                <w:bCs w:val="false"/>
+                <w:i w:val="false"/>
+                <w:iCs w:val="false"/>
+                <w:color w:val="1A1A1A"/>
+                <w:sz w:val="19"/>
+                <w:szCs w:val="19"/>
+              </w:rPr>
+              <w:t>2</w:t>
+            </w:r>
+          </w:p>
+        </w:tc>
+        <w:tc>
+          <w:tcPr>
+            <w:tcW w:type="dxa" w:w="1800"/>
+            <w:tcBorders>
+              <w:top w:val="single" w:color="C5CDD4" w:sz="1"/>
+              <w:left w:val="single" w:color="C5CDD4" w:sz="1"/>
+              <w:bottom w:val="single" w:color="C5CDD4" w:sz="1"/>
+              <w:right w:val="single" w:color="C5CDD4" w:sz="1"/>
+            </w:tcBorders>
+            <w:tcMar>
+              <w:top w:type="dxa" w:w="50"/>
+              <w:left w:type="dxa" w:w="80"/>
+              <w:bottom w:type="dxa" w:w="50"/>
+              <w:right w:type="dxa" w:w="80"/>
+            </w:tcMar>
+          </w:tcPr>
+          <w:p>
+            <w:pPr>
+              <w:spacing w:after="15" w:before="15"/>
+              <w:jc w:val="center"/>
+            </w:pPr>
+            <w:r>
+              <w:rPr>
+                <w:rFonts w:ascii="Arial" w:cs="Arial" w:eastAsia="Arial" w:hAnsi="Arial"/>
+                <w:b w:val="false"/>
+                <w:bCs w:val="false"/>
+                <w:i w:val="false"/>
+                <w:iCs w:val="false"/>
+                <w:color w:val="1A1A1A"/>
+                <w:sz w:val="19"/>
+                <w:szCs w:val="19"/>
+              </w:rPr>
+              <w:t>3</w:t>
+            </w:r>
+          </w:p>
+        </w:tc>
+        <w:tc>
+          <w:tcPr>
+            <w:tcW w:type="dxa" w:w="1800"/>
+            <w:tcBorders>
+              <w:top w:val="single" w:color="C5CDD4" w:sz="1"/>
+              <w:left w:val="single" w:color="C5CDD4" w:sz="1"/>
+              <w:bottom w:val="single" w:color="C5CDD4" w:sz="1"/>
+              <w:right w:val="single" w:color="C5CDD4" w:sz="1"/>
+            </w:tcBorders>
+            <w:tcMar>
+              <w:top w:type="dxa" w:w="50"/>
+              <w:left w:type="dxa" w:w="80"/>
+              <w:bottom w:type="dxa" w:w="50"/>
+              <w:right w:type="dxa" w:w="80"/>
+            </w:tcMar>
+          </w:tcPr>
+          <w:p>
+            <w:pPr>
+              <w:spacing w:after="15" w:before="15"/>
+              <w:jc w:val="center"/>
+            </w:pPr>
+            <w:r>
+              <w:rPr>
+                <w:rFonts w:ascii="Arial" w:cs="Arial" w:eastAsia="Arial" w:hAnsi="Arial"/>
+                <w:b w:val="false"/>
+                <w:bCs w:val="false"/>
+                <w:i w:val="false"/>
+                <w:iCs w:val="false"/>
+                <w:color w:val="1A1A1A"/>
+                <w:sz w:val="19"/>
+                <w:szCs w:val="19"/>
+              </w:rPr>
+              <w:t>0</w:t>
             </w:r>
           </w:p>
         </w:tc>
@@ -6984,6 +6994,7 @@
                 <w:sz w:val="19"/>
                 <w:szCs w:val="19"/>
               </w:rPr>
+              <w:t>5</w:t>
             </w:r>
           </w:p>
         </w:tc>
@@ -7057,7 +7068,7 @@
                 <w:sz w:val="19"/>
                 <w:szCs w:val="19"/>
               </w:rPr>
-              <w:t xml:space="preserve"/>
+              <w:t>Sweet Potato Cinnamon Parfait</w:t>
             </w:r>
           </w:p>
         </w:tc>
@@ -7094,7 +7105,7 @@
                 <w:sz w:val="19"/>
                 <w:szCs w:val="19"/>
               </w:rPr>
-              <w:t xml:space="preserve"/>
+              <w:t>1</w:t>
             </w:r>
           </w:p>
         </w:tc>
@@ -7131,7 +7142,7 @@
                 <w:sz w:val="19"/>
                 <w:szCs w:val="19"/>
               </w:rPr>
-              <w:t xml:space="preserve"/>
+              <w:t>3</w:t>
             </w:r>
           </w:p>
         </w:tc>
@@ -7168,7 +7179,7 @@
                 <w:sz w:val="19"/>
                 <w:szCs w:val="19"/>
               </w:rPr>
-              <w:t xml:space="preserve"/>
+              <w:t>0</w:t>
             </w:r>
           </w:p>
         </w:tc>
@@ -7205,7 +7216,7 @@
                 <w:sz w:val="19"/>
                 <w:szCs w:val="19"/>
               </w:rPr>
-              <w:t xml:space="preserve"/>
+              <w:t>4</w:t>
             </w:r>
           </w:p>
         </w:tc>
@@ -7242,7 +7253,7 @@
                 <w:sz w:val="17"/>
                 <w:szCs w:val="17"/>
               </w:rPr>
-              <w:t xml:space="preserve"/>
+              <w:t>Surplus sweet potatoes</w:t>
             </w:r>
           </w:p>
         </w:tc>
@@ -7536,7 +7547,7 @@
                 <w:sz w:val="18"/>
                 <w:szCs w:val="18"/>
               </w:rPr>
-              <w:t>0</w:t>
+              <w:t>3</w:t>
             </w:r>
           </w:p>
         </w:tc>
@@ -7573,7 +7584,7 @@
                 <w:sz w:val="18"/>
                 <w:szCs w:val="18"/>
               </w:rPr>
-              <w:t>0</w:t>
+              <w:t>6</w:t>
             </w:r>
           </w:p>
         </w:tc>
@@ -7647,7 +7658,7 @@
                 <w:sz w:val="18"/>
                 <w:szCs w:val="18"/>
               </w:rPr>
-              <w:t>0</w:t>
+              <w:t>9</w:t>
             </w:r>
           </w:p>
         </w:tc>
@@ -7760,7 +7771,7 @@
                 <w:sz w:val="22"/>
                 <w:szCs w:val="22"/>
               </w:rPr>
-              <w:t>36</w:t>
+              <w:t>52</w:t>
             </w:r>
           </w:p>
         </w:tc>
@@ -7797,7 +7808,7 @@
                 <w:sz w:val="22"/>
                 <w:szCs w:val="22"/>
               </w:rPr>
-              <w:t>52</w:t>
+              <w:t>75</w:t>
             </w:r>
           </w:p>
         </w:tc>
@@ -7834,7 +7845,7 @@
                 <w:sz w:val="22"/>
                 <w:szCs w:val="22"/>
               </w:rPr>
-              <w:t>72</w:t>
+              <w:t>78</w:t>
             </w:r>
           </w:p>
         </w:tc>
@@ -7871,7 +7882,7 @@
                 <w:sz w:val="22"/>
                 <w:szCs w:val="22"/>
               </w:rPr>
-              <w:t>160</w:t>
+              <w:t>205</w:t>
             </w:r>
           </w:p>
         </w:tc>

</xml_diff>

<commit_message>
Add Spaghetti & Meatballs w/ Tomato Basil Sauce to lunch bowls
New Caney only, 3 units on Monday PM delivery. Added to kitchen
spreadsheet, partner doc, weekly menu, and master recipe database.

https://claude.ai/code/session_01RoU8RfG3RfKf7Zo4boqHgn
</commit_message>
<xml_diff>
--- a/CC_GrabAndGo_Week12_Partner_v1.docx
+++ b/CC_GrabAndGo_Week12_Partner_v1.docx
@@ -5001,115 +5001,115 @@
                 <w:sz w:val="19"/>
                 <w:szCs w:val="19"/>
               </w:rPr>
-              <w:t xml:space="preserve"/>
-            </w:r>
-          </w:p>
-        </w:tc>
-        <w:tc>
-          <w:tcPr>
-            <w:tcW w:type="dxa" w:w="1800"/>
-            <w:tcBorders>
-              <w:top w:val="single" w:color="C5CDD4" w:sz="1"/>
-              <w:left w:val="single" w:color="C5CDD4" w:sz="1"/>
-              <w:bottom w:val="single" w:color="C5CDD4" w:sz="1"/>
-              <w:right w:val="single" w:color="C5CDD4" w:sz="1"/>
-            </w:tcBorders>
-            <w:tcMar>
-              <w:top w:type="dxa" w:w="50"/>
-              <w:left w:type="dxa" w:w="80"/>
-              <w:bottom w:type="dxa" w:w="50"/>
-              <w:right w:type="dxa" w:w="80"/>
-            </w:tcMar>
-          </w:tcPr>
-          <w:p>
-            <w:pPr>
-              <w:spacing w:after="15" w:before="15"/>
-              <w:jc w:val="center"/>
-            </w:pPr>
-            <w:r>
-              <w:rPr>
-                <w:rFonts w:ascii="Arial" w:cs="Arial" w:eastAsia="Arial" w:hAnsi="Arial"/>
-                <w:b w:val="false"/>
-                <w:bCs w:val="false"/>
-                <w:i w:val="false"/>
-                <w:iCs w:val="false"/>
-                <w:color w:val="1A1A1A"/>
-                <w:sz w:val="19"/>
-                <w:szCs w:val="19"/>
-              </w:rPr>
-              <w:t xml:space="preserve"/>
-            </w:r>
-          </w:p>
-        </w:tc>
-        <w:tc>
-          <w:tcPr>
-            <w:tcW w:type="dxa" w:w="1800"/>
-            <w:tcBorders>
-              <w:top w:val="single" w:color="C5CDD4" w:sz="1"/>
-              <w:left w:val="single" w:color="C5CDD4" w:sz="1"/>
-              <w:bottom w:val="single" w:color="C5CDD4" w:sz="1"/>
-              <w:right w:val="single" w:color="C5CDD4" w:sz="1"/>
-            </w:tcBorders>
-            <w:tcMar>
-              <w:top w:type="dxa" w:w="50"/>
-              <w:left w:type="dxa" w:w="80"/>
-              <w:bottom w:type="dxa" w:w="50"/>
-              <w:right w:type="dxa" w:w="80"/>
-            </w:tcMar>
-          </w:tcPr>
-          <w:p>
-            <w:pPr>
-              <w:spacing w:after="15" w:before="15"/>
-              <w:jc w:val="center"/>
-            </w:pPr>
-            <w:r>
-              <w:rPr>
-                <w:rFonts w:ascii="Arial" w:cs="Arial" w:eastAsia="Arial" w:hAnsi="Arial"/>
-                <w:b w:val="false"/>
-                <w:bCs w:val="false"/>
-                <w:i w:val="false"/>
-                <w:iCs w:val="false"/>
-                <w:color w:val="1A1A1A"/>
-                <w:sz w:val="19"/>
-                <w:szCs w:val="19"/>
-              </w:rPr>
-              <w:t xml:space="preserve"/>
-            </w:r>
-          </w:p>
-        </w:tc>
-        <w:tc>
-          <w:tcPr>
-            <w:tcW w:type="dxa" w:w="1800"/>
-            <w:tcBorders>
-              <w:top w:val="single" w:color="C5CDD4" w:sz="1"/>
-              <w:left w:val="single" w:color="C5CDD4" w:sz="1"/>
-              <w:bottom w:val="single" w:color="C5CDD4" w:sz="1"/>
-              <w:right w:val="single" w:color="C5CDD4" w:sz="1"/>
-            </w:tcBorders>
-            <w:tcMar>
-              <w:top w:type="dxa" w:w="50"/>
-              <w:left w:type="dxa" w:w="80"/>
-              <w:bottom w:type="dxa" w:w="50"/>
-              <w:right w:type="dxa" w:w="80"/>
-            </w:tcMar>
-          </w:tcPr>
-          <w:p>
-            <w:pPr>
-              <w:spacing w:after="15" w:before="15"/>
-              <w:jc w:val="center"/>
-            </w:pPr>
-            <w:r>
-              <w:rPr>
-                <w:rFonts w:ascii="Arial" w:cs="Arial" w:eastAsia="Arial" w:hAnsi="Arial"/>
-                <w:b w:val="false"/>
-                <w:bCs w:val="false"/>
-                <w:i w:val="false"/>
-                <w:iCs w:val="false"/>
-                <w:color w:val="1A1A1A"/>
-                <w:sz w:val="19"/>
-                <w:szCs w:val="19"/>
-              </w:rPr>
-              <w:t xml:space="preserve"/>
+              <w:t>Spaghetti &amp; Meatballs w/ Tomato Basil Sauce</w:t>
+            </w:r>
+          </w:p>
+        </w:tc>
+        <w:tc>
+          <w:tcPr>
+            <w:tcW w:type="dxa" w:w="1800"/>
+            <w:tcBorders>
+              <w:top w:val="single" w:color="C5CDD4" w:sz="1"/>
+              <w:left w:val="single" w:color="C5CDD4" w:sz="1"/>
+              <w:bottom w:val="single" w:color="C5CDD4" w:sz="1"/>
+              <w:right w:val="single" w:color="C5CDD4" w:sz="1"/>
+            </w:tcBorders>
+            <w:tcMar>
+              <w:top w:type="dxa" w:w="50"/>
+              <w:left w:type="dxa" w:w="80"/>
+              <w:bottom w:type="dxa" w:w="50"/>
+              <w:right w:type="dxa" w:w="80"/>
+            </w:tcMar>
+          </w:tcPr>
+          <w:p>
+            <w:pPr>
+              <w:spacing w:after="15" w:before="15"/>
+              <w:jc w:val="center"/>
+            </w:pPr>
+            <w:r>
+              <w:rPr>
+                <w:rFonts w:ascii="Arial" w:cs="Arial" w:eastAsia="Arial" w:hAnsi="Arial"/>
+                <w:b w:val="false"/>
+                <w:bCs w:val="false"/>
+                <w:i w:val="false"/>
+                <w:iCs w:val="false"/>
+                <w:color w:val="1A1A1A"/>
+                <w:sz w:val="19"/>
+                <w:szCs w:val="19"/>
+              </w:rPr>
+              <w:t>0</w:t>
+            </w:r>
+          </w:p>
+        </w:tc>
+        <w:tc>
+          <w:tcPr>
+            <w:tcW w:type="dxa" w:w="1800"/>
+            <w:tcBorders>
+              <w:top w:val="single" w:color="C5CDD4" w:sz="1"/>
+              <w:left w:val="single" w:color="C5CDD4" w:sz="1"/>
+              <w:bottom w:val="single" w:color="C5CDD4" w:sz="1"/>
+              <w:right w:val="single" w:color="C5CDD4" w:sz="1"/>
+            </w:tcBorders>
+            <w:tcMar>
+              <w:top w:type="dxa" w:w="50"/>
+              <w:left w:type="dxa" w:w="80"/>
+              <w:bottom w:type="dxa" w:w="50"/>
+              <w:right w:type="dxa" w:w="80"/>
+            </w:tcMar>
+          </w:tcPr>
+          <w:p>
+            <w:pPr>
+              <w:spacing w:after="15" w:before="15"/>
+              <w:jc w:val="center"/>
+            </w:pPr>
+            <w:r>
+              <w:rPr>
+                <w:rFonts w:ascii="Arial" w:cs="Arial" w:eastAsia="Arial" w:hAnsi="Arial"/>
+                <w:b w:val="false"/>
+                <w:bCs w:val="false"/>
+                <w:i w:val="false"/>
+                <w:iCs w:val="false"/>
+                <w:color w:val="1A1A1A"/>
+                <w:sz w:val="19"/>
+                <w:szCs w:val="19"/>
+              </w:rPr>
+              <w:t>3</w:t>
+            </w:r>
+          </w:p>
+        </w:tc>
+        <w:tc>
+          <w:tcPr>
+            <w:tcW w:type="dxa" w:w="1800"/>
+            <w:tcBorders>
+              <w:top w:val="single" w:color="C5CDD4" w:sz="1"/>
+              <w:left w:val="single" w:color="C5CDD4" w:sz="1"/>
+              <w:bottom w:val="single" w:color="C5CDD4" w:sz="1"/>
+              <w:right w:val="single" w:color="C5CDD4" w:sz="1"/>
+            </w:tcBorders>
+            <w:tcMar>
+              <w:top w:type="dxa" w:w="50"/>
+              <w:left w:type="dxa" w:w="80"/>
+              <w:bottom w:type="dxa" w:w="50"/>
+              <w:right w:type="dxa" w:w="80"/>
+            </w:tcMar>
+          </w:tcPr>
+          <w:p>
+            <w:pPr>
+              <w:spacing w:after="15" w:before="15"/>
+              <w:jc w:val="center"/>
+            </w:pPr>
+            <w:r>
+              <w:rPr>
+                <w:rFonts w:ascii="Arial" w:cs="Arial" w:eastAsia="Arial" w:hAnsi="Arial"/>
+                <w:b w:val="false"/>
+                <w:bCs w:val="false"/>
+                <w:i w:val="false"/>
+                <w:iCs w:val="false"/>
+                <w:color w:val="1A1A1A"/>
+                <w:sz w:val="19"/>
+                <w:szCs w:val="19"/>
+              </w:rPr>
+              <w:t>0</w:t>
             </w:r>
           </w:p>
         </w:tc>
@@ -5145,7 +5145,7 @@
                 <w:sz w:val="19"/>
                 <w:szCs w:val="19"/>
               </w:rPr>
-              <w:t xml:space="preserve"/>
+              <w:t>3</w:t>
             </w:r>
           </w:p>
         </w:tc>
@@ -5181,7 +5181,6 @@
                 <w:sz w:val="17"/>
                 <w:szCs w:val="17"/>
               </w:rPr>
-              <w:t xml:space="preserve"/>
             </w:r>
           </w:p>
         </w:tc>
@@ -5518,7 +5517,7 @@
                 <w:sz w:val="18"/>
                 <w:szCs w:val="18"/>
               </w:rPr>
-              <w:t>16</w:t>
+              <w:t>19</w:t>
             </w:r>
           </w:p>
         </w:tc>
@@ -5592,7 +5591,7 @@
                 <w:sz w:val="18"/>
                 <w:szCs w:val="18"/>
               </w:rPr>
-              <w:t>24</w:t>
+              <w:t>27</w:t>
             </w:r>
           </w:p>
         </w:tc>
@@ -7808,7 +7807,7 @@
                 <w:sz w:val="22"/>
                 <w:szCs w:val="22"/>
               </w:rPr>
-              <w:t>75</w:t>
+              <w:t>78</w:t>
             </w:r>
           </w:p>
         </w:tc>
@@ -7882,7 +7881,7 @@
                 <w:sz w:val="22"/>
                 <w:szCs w:val="22"/>
               </w:rPr>
-              <w:t>205</w:t>
+              <w:t>208</w:t>
             </w:r>
           </w:p>
         </w:tc>

</xml_diff>

<commit_message>
Update Beef Empanadas to weekly staple — 15 units Conroe every Friday
Standing order: 15 empanadas for Conroe weekend inventory on every
Friday AM delivery. Marked as weekly staple across all documents.

https://claude.ai/code/session_01RoU8RfG3RfKf7Zo4boqHgn
</commit_message>
<xml_diff>
--- a/CC_GrabAndGo_Week12_Partner_v1.docx
+++ b/CC_GrabAndGo_Week12_Partner_v1.docx
@@ -5812,7 +5812,7 @@
                 <w:sz w:val="19"/>
                 <w:szCs w:val="19"/>
               </w:rPr>
-              <w:t xml:space="preserve">12</w:t>
+              <w:t>15</w:t>
             </w:r>
           </w:p>
         </w:tc>
@@ -5848,7 +5848,7 @@
                 <w:sz w:val="19"/>
                 <w:szCs w:val="19"/>
               </w:rPr>
-              <w:t xml:space="preserve">17</w:t>
+              <w:t>20</w:t>
             </w:r>
           </w:p>
         </w:tc>
@@ -5884,7 +5884,7 @@
                 <w:sz w:val="17"/>
                 <w:szCs w:val="17"/>
               </w:rPr>
-              <w:t xml:space="preserve"/>
+              <w:t>Weekly staple — Conroe Fri</w:t>
             </w:r>
           </w:p>
         </w:tc>
@@ -6699,7 +6699,7 @@
                 <w:sz w:val="18"/>
                 <w:szCs w:val="18"/>
               </w:rPr>
-              <w:t>18</w:t>
+              <w:t>21</w:t>
             </w:r>
           </w:p>
         </w:tc>
@@ -6736,7 +6736,7 @@
                 <w:sz w:val="18"/>
                 <w:szCs w:val="18"/>
               </w:rPr>
-              <w:t>41</w:t>
+              <w:t>44</w:t>
             </w:r>
           </w:p>
         </w:tc>
@@ -7844,7 +7844,7 @@
                 <w:sz w:val="22"/>
                 <w:szCs w:val="22"/>
               </w:rPr>
-              <w:t>78</w:t>
+              <w:t>81</w:t>
             </w:r>
           </w:p>
         </w:tc>
@@ -7881,7 +7881,7 @@
                 <w:sz w:val="22"/>
                 <w:szCs w:val="22"/>
               </w:rPr>
-              <w:t>208</w:t>
+              <w:t>211</w:t>
             </w:r>
           </w:p>
         </w:tc>

</xml_diff>